<commit_message>
doc(rapport): Ajout de l'introduction au rapport
</commit_message>
<xml_diff>
--- a/doc/src/AugustoRomain-P_DB_GestionAeroport-Rapport.docx
+++ b/doc/src/AugustoRomain-P_DB_GestionAeroport-Rapport.docx
@@ -2874,6 +2874,36 @@
     </w:p>
     <w:p>
       <w:pPr>
+        <w:ind w:left="426"/>
+        <w:jc w:val="both"/>
+        <w:rPr>
+          <w:rFonts w:ascii="Calibri" w:hAnsi="Calibri" w:cs="Calibri"/>
+        </w:rPr>
+      </w:pPr>
+      <w:r>
+        <w:rPr>
+          <w:rFonts w:ascii="Calibri" w:hAnsi="Calibri" w:cs="Calibri"/>
+        </w:rPr>
+        <w:t>Ce projet a pour objectif de réaliser une base de données relationnelle pour la gestion d’un aéroport. Cette base de données permettra de gérer différentes informations comme les avions, les compagnies aériennes, les vols, les passagers et les réservations.</w:t>
+      </w:r>
+    </w:p>
+    <w:p>
+      <w:pPr>
+        <w:ind w:left="426"/>
+        <w:jc w:val="both"/>
+        <w:rPr>
+          <w:rFonts w:ascii="Calibri" w:hAnsi="Calibri" w:cs="Calibri"/>
+        </w:rPr>
+      </w:pPr>
+      <w:r>
+        <w:rPr>
+          <w:rFonts w:ascii="Calibri" w:hAnsi="Calibri" w:cs="Calibri"/>
+        </w:rPr>
+        <w:t xml:space="preserve">La base de données sera d’abord modélisée avec looping et la méthode MERISE. Ensuite les différentes tables et données seront transformée en code grâce à looping, puis importer dans une vraie base de données. Pour finir, plusieurs requêtes SQL seront réalisées afin de manipuler et exploiter les données. </w:t>
+      </w:r>
+    </w:p>
+    <w:p>
+      <w:pPr>
         <w:pStyle w:val="Titre1"/>
         <w:spacing w:after="0" w:line="240" w:lineRule="auto"/>
         <w:rPr>
@@ -2998,6 +3028,7 @@
           <w:sz w:val="36"/>
           <w:szCs w:val="36"/>
         </w:rPr>
+        <w:lastRenderedPageBreak/>
         <w:t>3.2 Création des tables de la base de données</w:t>
       </w:r>
       <w:bookmarkEnd w:id="4"/>
@@ -3045,6 +3076,7 @@
           <w:sz w:val="36"/>
           <w:szCs w:val="36"/>
         </w:rPr>
+        <w:lastRenderedPageBreak/>
         <w:t>3.3 Chargement des données</w:t>
       </w:r>
       <w:bookmarkEnd w:id="5"/>
@@ -3092,6 +3124,7 @@
           <w:sz w:val="36"/>
           <w:szCs w:val="36"/>
         </w:rPr>
+        <w:lastRenderedPageBreak/>
         <w:t>3.4 Requêtes SQL</w:t>
       </w:r>
       <w:bookmarkEnd w:id="6"/>
@@ -3139,6 +3172,7 @@
           <w:sz w:val="36"/>
           <w:szCs w:val="36"/>
         </w:rPr>
+        <w:lastRenderedPageBreak/>
         <w:t>3.5 Index</w:t>
       </w:r>
       <w:bookmarkEnd w:id="7"/>
@@ -3186,6 +3220,7 @@
           <w:sz w:val="36"/>
           <w:szCs w:val="36"/>
         </w:rPr>
+        <w:lastRenderedPageBreak/>
         <w:t>3.6 Utilisateurs et rôles</w:t>
       </w:r>
       <w:bookmarkEnd w:id="8"/>
@@ -3233,6 +3268,7 @@
           <w:sz w:val="36"/>
           <w:szCs w:val="36"/>
         </w:rPr>
+        <w:lastRenderedPageBreak/>
         <w:t>3.7 Transaction</w:t>
       </w:r>
       <w:bookmarkEnd w:id="9"/>
@@ -3303,6 +3339,7 @@
           <w:b/>
           <w:bCs/>
         </w:rPr>
+        <w:lastRenderedPageBreak/>
         <w:t>5. Conclusion</w:t>
       </w:r>
       <w:bookmarkEnd w:id="11"/>
@@ -3344,6 +3381,7 @@
           <w:b/>
           <w:bCs/>
         </w:rPr>
+        <w:lastRenderedPageBreak/>
         <w:t>6. Sources</w:t>
       </w:r>
       <w:bookmarkEnd w:id="12"/>
@@ -3385,6 +3423,7 @@
           <w:b/>
           <w:bCs/>
         </w:rPr>
+        <w:lastRenderedPageBreak/>
         <w:t>7. Annexes</w:t>
       </w:r>
       <w:bookmarkEnd w:id="13"/>
@@ -3807,6 +3846,95 @@
     </w:lvl>
   </w:abstractNum>
   <w:abstractNum w:abstractNumId="1" w15:restartNumberingAfterBreak="0">
+    <w:nsid w:val="0A643EFC"/>
+    <w:multiLevelType w:val="hybridMultilevel"/>
+    <w:tmpl w:val="FB267D4C"/>
+    <w:lvl w:ilvl="0" w:tplc="EBDAC1F8">
+      <w:start w:val="1"/>
+      <w:numFmt w:val="decimal"/>
+      <w:lvlText w:val="%1."/>
+      <w:lvlJc w:val="left"/>
+      <w:pPr>
+        <w:ind w:left="765" w:hanging="405"/>
+      </w:pPr>
+      <w:rPr>
+        <w:rFonts w:hint="default"/>
+      </w:rPr>
+    </w:lvl>
+    <w:lvl w:ilvl="1" w:tplc="100C0019" w:tentative="1">
+      <w:start w:val="1"/>
+      <w:numFmt w:val="lowerLetter"/>
+      <w:lvlText w:val="%2."/>
+      <w:lvlJc w:val="left"/>
+      <w:pPr>
+        <w:ind w:left="1440" w:hanging="360"/>
+      </w:pPr>
+    </w:lvl>
+    <w:lvl w:ilvl="2" w:tplc="100C001B" w:tentative="1">
+      <w:start w:val="1"/>
+      <w:numFmt w:val="lowerRoman"/>
+      <w:lvlText w:val="%3."/>
+      <w:lvlJc w:val="right"/>
+      <w:pPr>
+        <w:ind w:left="2160" w:hanging="180"/>
+      </w:pPr>
+    </w:lvl>
+    <w:lvl w:ilvl="3" w:tplc="100C000F" w:tentative="1">
+      <w:start w:val="1"/>
+      <w:numFmt w:val="decimal"/>
+      <w:lvlText w:val="%4."/>
+      <w:lvlJc w:val="left"/>
+      <w:pPr>
+        <w:ind w:left="2880" w:hanging="360"/>
+      </w:pPr>
+    </w:lvl>
+    <w:lvl w:ilvl="4" w:tplc="100C0019" w:tentative="1">
+      <w:start w:val="1"/>
+      <w:numFmt w:val="lowerLetter"/>
+      <w:lvlText w:val="%5."/>
+      <w:lvlJc w:val="left"/>
+      <w:pPr>
+        <w:ind w:left="3600" w:hanging="360"/>
+      </w:pPr>
+    </w:lvl>
+    <w:lvl w:ilvl="5" w:tplc="100C001B" w:tentative="1">
+      <w:start w:val="1"/>
+      <w:numFmt w:val="lowerRoman"/>
+      <w:lvlText w:val="%6."/>
+      <w:lvlJc w:val="right"/>
+      <w:pPr>
+        <w:ind w:left="4320" w:hanging="180"/>
+      </w:pPr>
+    </w:lvl>
+    <w:lvl w:ilvl="6" w:tplc="100C000F" w:tentative="1">
+      <w:start w:val="1"/>
+      <w:numFmt w:val="decimal"/>
+      <w:lvlText w:val="%7."/>
+      <w:lvlJc w:val="left"/>
+      <w:pPr>
+        <w:ind w:left="5040" w:hanging="360"/>
+      </w:pPr>
+    </w:lvl>
+    <w:lvl w:ilvl="7" w:tplc="100C0019" w:tentative="1">
+      <w:start w:val="1"/>
+      <w:numFmt w:val="lowerLetter"/>
+      <w:lvlText w:val="%8."/>
+      <w:lvlJc w:val="left"/>
+      <w:pPr>
+        <w:ind w:left="5760" w:hanging="360"/>
+      </w:pPr>
+    </w:lvl>
+    <w:lvl w:ilvl="8" w:tplc="100C001B" w:tentative="1">
+      <w:start w:val="1"/>
+      <w:numFmt w:val="lowerRoman"/>
+      <w:lvlText w:val="%9."/>
+      <w:lvlJc w:val="right"/>
+      <w:pPr>
+        <w:ind w:left="6480" w:hanging="180"/>
+      </w:pPr>
+    </w:lvl>
+  </w:abstractNum>
+  <w:abstractNum w:abstractNumId="2" w15:restartNumberingAfterBreak="0">
     <w:nsid w:val="0F475356"/>
     <w:multiLevelType w:val="multilevel"/>
     <w:tmpl w:val="087CD598"/>
@@ -3927,7 +4055,7 @@
       </w:rPr>
     </w:lvl>
   </w:abstractNum>
-  <w:abstractNum w:abstractNumId="2" w15:restartNumberingAfterBreak="0">
+  <w:abstractNum w:abstractNumId="3" w15:restartNumberingAfterBreak="0">
     <w:nsid w:val="102105BB"/>
     <w:multiLevelType w:val="hybridMultilevel"/>
     <w:tmpl w:val="E9D66C64"/>
@@ -4040,7 +4168,7 @@
       </w:rPr>
     </w:lvl>
   </w:abstractNum>
-  <w:abstractNum w:abstractNumId="3" w15:restartNumberingAfterBreak="0">
+  <w:abstractNum w:abstractNumId="4" w15:restartNumberingAfterBreak="0">
     <w:nsid w:val="1D4D594A"/>
     <w:multiLevelType w:val="hybridMultilevel"/>
     <w:tmpl w:val="F3A0CA4E"/>
@@ -4129,7 +4257,7 @@
       </w:pPr>
     </w:lvl>
   </w:abstractNum>
-  <w:abstractNum w:abstractNumId="4" w15:restartNumberingAfterBreak="0">
+  <w:abstractNum w:abstractNumId="5" w15:restartNumberingAfterBreak="0">
     <w:nsid w:val="1FEF46F5"/>
     <w:multiLevelType w:val="hybridMultilevel"/>
     <w:tmpl w:val="BF940428"/>
@@ -4242,7 +4370,7 @@
       </w:rPr>
     </w:lvl>
   </w:abstractNum>
-  <w:abstractNum w:abstractNumId="5" w15:restartNumberingAfterBreak="0">
+  <w:abstractNum w:abstractNumId="6" w15:restartNumberingAfterBreak="0">
     <w:nsid w:val="24453363"/>
     <w:multiLevelType w:val="hybridMultilevel"/>
     <w:tmpl w:val="5510CBF4"/>
@@ -4328,7 +4456,7 @@
       </w:pPr>
     </w:lvl>
   </w:abstractNum>
-  <w:abstractNum w:abstractNumId="6" w15:restartNumberingAfterBreak="0">
+  <w:abstractNum w:abstractNumId="7" w15:restartNumberingAfterBreak="0">
     <w:nsid w:val="266D6958"/>
     <w:multiLevelType w:val="hybridMultilevel"/>
     <w:tmpl w:val="5BE24594"/>
@@ -4441,7 +4569,7 @@
       </w:rPr>
     </w:lvl>
   </w:abstractNum>
-  <w:abstractNum w:abstractNumId="7" w15:restartNumberingAfterBreak="0">
+  <w:abstractNum w:abstractNumId="8" w15:restartNumberingAfterBreak="0">
     <w:nsid w:val="2FFA3416"/>
     <w:multiLevelType w:val="hybridMultilevel"/>
     <w:tmpl w:val="BC3243AE"/>
@@ -4554,7 +4682,7 @@
       </w:rPr>
     </w:lvl>
   </w:abstractNum>
-  <w:abstractNum w:abstractNumId="8" w15:restartNumberingAfterBreak="0">
+  <w:abstractNum w:abstractNumId="9" w15:restartNumberingAfterBreak="0">
     <w:nsid w:val="351F27AF"/>
     <w:multiLevelType w:val="hybridMultilevel"/>
     <w:tmpl w:val="4FACF0EA"/>
@@ -4667,7 +4795,7 @@
       </w:rPr>
     </w:lvl>
   </w:abstractNum>
-  <w:abstractNum w:abstractNumId="9" w15:restartNumberingAfterBreak="0">
+  <w:abstractNum w:abstractNumId="10" w15:restartNumberingAfterBreak="0">
     <w:nsid w:val="37A45B63"/>
     <w:multiLevelType w:val="hybridMultilevel"/>
     <w:tmpl w:val="4CBAE43C"/>
@@ -4780,7 +4908,7 @@
       </w:rPr>
     </w:lvl>
   </w:abstractNum>
-  <w:abstractNum w:abstractNumId="10" w15:restartNumberingAfterBreak="0">
+  <w:abstractNum w:abstractNumId="11" w15:restartNumberingAfterBreak="0">
     <w:nsid w:val="38027554"/>
     <w:multiLevelType w:val="hybridMultilevel"/>
     <w:tmpl w:val="C60EC468"/>
@@ -4893,7 +5021,7 @@
       </w:rPr>
     </w:lvl>
   </w:abstractNum>
-  <w:abstractNum w:abstractNumId="11" w15:restartNumberingAfterBreak="0">
+  <w:abstractNum w:abstractNumId="12" w15:restartNumberingAfterBreak="0">
     <w:nsid w:val="3EAC0DBD"/>
     <w:multiLevelType w:val="hybridMultilevel"/>
     <w:tmpl w:val="6602F682"/>
@@ -5006,7 +5134,7 @@
       </w:rPr>
     </w:lvl>
   </w:abstractNum>
-  <w:abstractNum w:abstractNumId="12" w15:restartNumberingAfterBreak="0">
+  <w:abstractNum w:abstractNumId="13" w15:restartNumberingAfterBreak="0">
     <w:nsid w:val="409E3B2C"/>
     <w:multiLevelType w:val="hybridMultilevel"/>
     <w:tmpl w:val="A16C1916"/>
@@ -5146,7 +5274,7 @@
       </w:rPr>
     </w:lvl>
   </w:abstractNum>
-  <w:abstractNum w:abstractNumId="13" w15:restartNumberingAfterBreak="0">
+  <w:abstractNum w:abstractNumId="14" w15:restartNumberingAfterBreak="0">
     <w:nsid w:val="46934322"/>
     <w:multiLevelType w:val="hybridMultilevel"/>
     <w:tmpl w:val="691E28DC"/>
@@ -5259,7 +5387,7 @@
       </w:rPr>
     </w:lvl>
   </w:abstractNum>
-  <w:abstractNum w:abstractNumId="14" w15:restartNumberingAfterBreak="0">
+  <w:abstractNum w:abstractNumId="15" w15:restartNumberingAfterBreak="0">
     <w:nsid w:val="4CE06E49"/>
     <w:multiLevelType w:val="hybridMultilevel"/>
     <w:tmpl w:val="A59E08BC"/>
@@ -5348,7 +5476,7 @@
       </w:pPr>
     </w:lvl>
   </w:abstractNum>
-  <w:abstractNum w:abstractNumId="15" w15:restartNumberingAfterBreak="0">
+  <w:abstractNum w:abstractNumId="16" w15:restartNumberingAfterBreak="0">
     <w:nsid w:val="51CB2DBF"/>
     <w:multiLevelType w:val="hybridMultilevel"/>
     <w:tmpl w:val="0DF25F8C"/>
@@ -5461,7 +5589,7 @@
       </w:rPr>
     </w:lvl>
   </w:abstractNum>
-  <w:abstractNum w:abstractNumId="16" w15:restartNumberingAfterBreak="0">
+  <w:abstractNum w:abstractNumId="17" w15:restartNumberingAfterBreak="0">
     <w:nsid w:val="569D7CC1"/>
     <w:multiLevelType w:val="hybridMultilevel"/>
     <w:tmpl w:val="B3A8C868"/>
@@ -5574,7 +5702,7 @@
       </w:rPr>
     </w:lvl>
   </w:abstractNum>
-  <w:abstractNum w:abstractNumId="17" w15:restartNumberingAfterBreak="0">
+  <w:abstractNum w:abstractNumId="18" w15:restartNumberingAfterBreak="0">
     <w:nsid w:val="611B2273"/>
     <w:multiLevelType w:val="hybridMultilevel"/>
     <w:tmpl w:val="7E50306A"/>
@@ -5687,7 +5815,7 @@
       </w:rPr>
     </w:lvl>
   </w:abstractNum>
-  <w:abstractNum w:abstractNumId="18" w15:restartNumberingAfterBreak="0">
+  <w:abstractNum w:abstractNumId="19" w15:restartNumberingAfterBreak="0">
     <w:nsid w:val="63F91084"/>
     <w:multiLevelType w:val="hybridMultilevel"/>
     <w:tmpl w:val="996088D6"/>
@@ -5800,7 +5928,7 @@
       </w:rPr>
     </w:lvl>
   </w:abstractNum>
-  <w:abstractNum w:abstractNumId="19" w15:restartNumberingAfterBreak="0">
+  <w:abstractNum w:abstractNumId="20" w15:restartNumberingAfterBreak="0">
     <w:nsid w:val="647F1D0D"/>
     <w:multiLevelType w:val="hybridMultilevel"/>
     <w:tmpl w:val="8648D7FE"/>
@@ -5886,7 +6014,7 @@
       </w:pPr>
     </w:lvl>
   </w:abstractNum>
-  <w:abstractNum w:abstractNumId="20" w15:restartNumberingAfterBreak="0">
+  <w:abstractNum w:abstractNumId="21" w15:restartNumberingAfterBreak="0">
     <w:nsid w:val="68706354"/>
     <w:multiLevelType w:val="hybridMultilevel"/>
     <w:tmpl w:val="D4CAF374"/>
@@ -6026,7 +6154,7 @@
       </w:rPr>
     </w:lvl>
   </w:abstractNum>
-  <w:abstractNum w:abstractNumId="21" w15:restartNumberingAfterBreak="0">
+  <w:abstractNum w:abstractNumId="22" w15:restartNumberingAfterBreak="0">
     <w:nsid w:val="6DF771E1"/>
     <w:multiLevelType w:val="hybridMultilevel"/>
     <w:tmpl w:val="28CC9E4A"/>
@@ -6139,7 +6267,7 @@
       </w:rPr>
     </w:lvl>
   </w:abstractNum>
-  <w:abstractNum w:abstractNumId="22" w15:restartNumberingAfterBreak="0">
+  <w:abstractNum w:abstractNumId="23" w15:restartNumberingAfterBreak="0">
     <w:nsid w:val="71B21769"/>
     <w:multiLevelType w:val="hybridMultilevel"/>
     <w:tmpl w:val="96C81336"/>
@@ -6252,7 +6380,7 @@
       </w:rPr>
     </w:lvl>
   </w:abstractNum>
-  <w:abstractNum w:abstractNumId="23" w15:restartNumberingAfterBreak="0">
+  <w:abstractNum w:abstractNumId="24" w15:restartNumberingAfterBreak="0">
     <w:nsid w:val="72CD635C"/>
     <w:multiLevelType w:val="hybridMultilevel"/>
     <w:tmpl w:val="2766D7A0"/>
@@ -6365,7 +6493,7 @@
       </w:rPr>
     </w:lvl>
   </w:abstractNum>
-  <w:abstractNum w:abstractNumId="24" w15:restartNumberingAfterBreak="0">
+  <w:abstractNum w:abstractNumId="25" w15:restartNumberingAfterBreak="0">
     <w:nsid w:val="785244FF"/>
     <w:multiLevelType w:val="hybridMultilevel"/>
     <w:tmpl w:val="7B56396A"/>
@@ -6451,7 +6579,7 @@
       </w:pPr>
     </w:lvl>
   </w:abstractNum>
-  <w:abstractNum w:abstractNumId="25" w15:restartNumberingAfterBreak="0">
+  <w:abstractNum w:abstractNumId="26" w15:restartNumberingAfterBreak="0">
     <w:nsid w:val="79756143"/>
     <w:multiLevelType w:val="hybridMultilevel"/>
     <w:tmpl w:val="6634534C"/>
@@ -6564,7 +6692,7 @@
       </w:rPr>
     </w:lvl>
   </w:abstractNum>
-  <w:abstractNum w:abstractNumId="26" w15:restartNumberingAfterBreak="0">
+  <w:abstractNum w:abstractNumId="27" w15:restartNumberingAfterBreak="0">
     <w:nsid w:val="7D4501B9"/>
     <w:multiLevelType w:val="hybridMultilevel"/>
     <w:tmpl w:val="83B64B2C"/>
@@ -6678,85 +6806,88 @@
     </w:lvl>
   </w:abstractNum>
   <w:num w:numId="1" w16cid:durableId="1203133388">
+    <w:abstractNumId w:val="20"/>
+  </w:num>
+  <w:num w:numId="2" w16cid:durableId="136774178">
+    <w:abstractNumId w:val="25"/>
+  </w:num>
+  <w:num w:numId="3" w16cid:durableId="1603030040">
+    <w:abstractNumId w:val="26"/>
+  </w:num>
+  <w:num w:numId="4" w16cid:durableId="328798260">
+    <w:abstractNumId w:val="16"/>
+  </w:num>
+  <w:num w:numId="5" w16cid:durableId="1009866966">
     <w:abstractNumId w:val="19"/>
   </w:num>
-  <w:num w:numId="2" w16cid:durableId="136774178">
-    <w:abstractNumId w:val="24"/>
+  <w:num w:numId="6" w16cid:durableId="886719929">
+    <w:abstractNumId w:val="27"/>
   </w:num>
-  <w:num w:numId="3" w16cid:durableId="1603030040">
-    <w:abstractNumId w:val="25"/>
+  <w:num w:numId="7" w16cid:durableId="1211848318">
+    <w:abstractNumId w:val="17"/>
   </w:num>
-  <w:num w:numId="4" w16cid:durableId="328798260">
+  <w:num w:numId="8" w16cid:durableId="1892644994">
+    <w:abstractNumId w:val="22"/>
+  </w:num>
+  <w:num w:numId="9" w16cid:durableId="644434909">
+    <w:abstractNumId w:val="9"/>
+  </w:num>
+  <w:num w:numId="10" w16cid:durableId="439683412">
+    <w:abstractNumId w:val="4"/>
+  </w:num>
+  <w:num w:numId="11" w16cid:durableId="939991775">
+    <w:abstractNumId w:val="2"/>
+  </w:num>
+  <w:num w:numId="12" w16cid:durableId="1222905011">
+    <w:abstractNumId w:val="13"/>
+  </w:num>
+  <w:num w:numId="13" w16cid:durableId="1861966893">
+    <w:abstractNumId w:val="21"/>
+  </w:num>
+  <w:num w:numId="14" w16cid:durableId="246967512">
     <w:abstractNumId w:val="15"/>
   </w:num>
-  <w:num w:numId="5" w16cid:durableId="1009866966">
-    <w:abstractNumId w:val="18"/>
-  </w:num>
-  <w:num w:numId="6" w16cid:durableId="886719929">
-    <w:abstractNumId w:val="26"/>
-  </w:num>
-  <w:num w:numId="7" w16cid:durableId="1211848318">
-    <w:abstractNumId w:val="16"/>
-  </w:num>
-  <w:num w:numId="8" w16cid:durableId="1892644994">
-    <w:abstractNumId w:val="21"/>
-  </w:num>
-  <w:num w:numId="9" w16cid:durableId="644434909">
-    <w:abstractNumId w:val="8"/>
-  </w:num>
-  <w:num w:numId="10" w16cid:durableId="439683412">
+  <w:num w:numId="15" w16cid:durableId="177357244">
     <w:abstractNumId w:val="3"/>
   </w:num>
-  <w:num w:numId="11" w16cid:durableId="939991775">
-    <w:abstractNumId w:val="1"/>
-  </w:num>
-  <w:num w:numId="12" w16cid:durableId="1222905011">
-    <w:abstractNumId w:val="12"/>
-  </w:num>
-  <w:num w:numId="13" w16cid:durableId="1861966893">
-    <w:abstractNumId w:val="20"/>
-  </w:num>
-  <w:num w:numId="14" w16cid:durableId="246967512">
-    <w:abstractNumId w:val="14"/>
-  </w:num>
-  <w:num w:numId="15" w16cid:durableId="177357244">
-    <w:abstractNumId w:val="2"/>
-  </w:num>
   <w:num w:numId="16" w16cid:durableId="326636809">
-    <w:abstractNumId w:val="5"/>
+    <w:abstractNumId w:val="6"/>
   </w:num>
   <w:num w:numId="17" w16cid:durableId="797644705">
-    <w:abstractNumId w:val="7"/>
+    <w:abstractNumId w:val="8"/>
   </w:num>
   <w:num w:numId="18" w16cid:durableId="1479542079">
     <w:abstractNumId w:val="0"/>
   </w:num>
   <w:num w:numId="19" w16cid:durableId="1195920320">
-    <w:abstractNumId w:val="9"/>
+    <w:abstractNumId w:val="10"/>
   </w:num>
   <w:num w:numId="20" w16cid:durableId="416832827">
+    <w:abstractNumId w:val="24"/>
+  </w:num>
+  <w:num w:numId="21" w16cid:durableId="1931964657">
+    <w:abstractNumId w:val="7"/>
+  </w:num>
+  <w:num w:numId="22" w16cid:durableId="1932395727">
+    <w:abstractNumId w:val="5"/>
+  </w:num>
+  <w:num w:numId="23" w16cid:durableId="927037760">
     <w:abstractNumId w:val="23"/>
   </w:num>
-  <w:num w:numId="21" w16cid:durableId="1931964657">
-    <w:abstractNumId w:val="6"/>
+  <w:num w:numId="24" w16cid:durableId="1124302307">
+    <w:abstractNumId w:val="12"/>
   </w:num>
-  <w:num w:numId="22" w16cid:durableId="1932395727">
-    <w:abstractNumId w:val="4"/>
+  <w:num w:numId="25" w16cid:durableId="483739954">
+    <w:abstractNumId w:val="14"/>
   </w:num>
-  <w:num w:numId="23" w16cid:durableId="927037760">
-    <w:abstractNumId w:val="22"/>
+  <w:num w:numId="26" w16cid:durableId="224683690">
+    <w:abstractNumId w:val="18"/>
   </w:num>
-  <w:num w:numId="24" w16cid:durableId="1124302307">
+  <w:num w:numId="27" w16cid:durableId="1440758041">
     <w:abstractNumId w:val="11"/>
   </w:num>
-  <w:num w:numId="25" w16cid:durableId="483739954">
-    <w:abstractNumId w:val="13"/>
-  </w:num>
-  <w:num w:numId="26" w16cid:durableId="224683690">
-    <w:abstractNumId w:val="17"/>
-  </w:num>
-  <w:num w:numId="27" w16cid:durableId="1440758041">
-    <w:abstractNumId w:val="10"/>
+  <w:num w:numId="28" w16cid:durableId="2104110605">
+    <w:abstractNumId w:val="1"/>
   </w:num>
 </w:numbering>
 </file>

</xml_diff>

<commit_message>
doc(rapport): Réalisation du fonctionnement de l'aéroport
</commit_message>
<xml_diff>
--- a/doc/src/AugustoRomain-P_DB_GestionAeroport-Rapport.docx
+++ b/doc/src/AugustoRomain-P_DB_GestionAeroport-Rapport.docx
@@ -1800,7 +1800,7 @@
           <w:r>
             <w:fldChar w:fldCharType="separate"/>
           </w:r>
-          <w:hyperlink w:anchor="_Toc241053688" w:history="1">
+          <w:hyperlink w:anchor="_Toc241054942" w:history="1">
             <w:r>
               <w:rPr>
                 <w:rStyle w:val="Lienhypertexte"/>
@@ -1824,7 +1824,7 @@
               <w:rPr>
                 <w:webHidden/>
               </w:rPr>
-              <w:instrText xml:space="preserve"> PAGEREF _Toc241053688 \h </w:instrText>
+              <w:instrText xml:space="preserve"> PAGEREF _Toc241054942 \h </w:instrText>
             </w:r>
             <w:r>
               <w:rPr>
@@ -1861,7 +1861,7 @@
               <w:lang w:eastAsia="fr-CH"/>
             </w:rPr>
           </w:pPr>
-          <w:hyperlink w:anchor="_Toc241053689" w:history="1">
+          <w:hyperlink w:anchor="_Toc241054943" w:history="1">
             <w:r>
               <w:rPr>
                 <w:rStyle w:val="Lienhypertexte"/>
@@ -1885,7 +1885,7 @@
               <w:rPr>
                 <w:webHidden/>
               </w:rPr>
-              <w:instrText xml:space="preserve"> PAGEREF _Toc241053689 \h </w:instrText>
+              <w:instrText xml:space="preserve"> PAGEREF _Toc241054943 \h </w:instrText>
             </w:r>
             <w:r>
               <w:rPr>
@@ -1922,7 +1922,7 @@
               <w:lang w:eastAsia="fr-CH"/>
             </w:rPr>
           </w:pPr>
-          <w:hyperlink w:anchor="_Toc241053690" w:history="1">
+          <w:hyperlink w:anchor="_Toc241054944" w:history="1">
             <w:r>
               <w:rPr>
                 <w:rStyle w:val="Lienhypertexte"/>
@@ -1946,7 +1946,7 @@
               <w:rPr>
                 <w:webHidden/>
               </w:rPr>
-              <w:instrText xml:space="preserve"> PAGEREF _Toc241053690 \h </w:instrText>
+              <w:instrText xml:space="preserve"> PAGEREF _Toc241054944 \h </w:instrText>
             </w:r>
             <w:r>
               <w:rPr>
@@ -1963,7 +1963,7 @@
               <w:rPr>
                 <w:webHidden/>
               </w:rPr>
-              <w:t>1</w:t>
+              <w:t>4</w:t>
             </w:r>
             <w:r>
               <w:rPr>
@@ -1985,7 +1985,7 @@
               <w:lang w:eastAsia="fr-CH"/>
             </w:rPr>
           </w:pPr>
-          <w:hyperlink w:anchor="_Toc241053691" w:history="1">
+          <w:hyperlink w:anchor="_Toc241054945" w:history="1">
             <w:r>
               <w:rPr>
                 <w:rStyle w:val="Lienhypertexte"/>
@@ -2015,7 +2015,7 @@
                 <w:noProof/>
                 <w:webHidden/>
               </w:rPr>
-              <w:instrText xml:space="preserve"> PAGEREF _Toc241053691 \h </w:instrText>
+              <w:instrText xml:space="preserve"> PAGEREF _Toc241054945 \h </w:instrText>
             </w:r>
             <w:r>
               <w:rPr>
@@ -2035,7 +2035,7 @@
                 <w:noProof/>
                 <w:webHidden/>
               </w:rPr>
-              <w:t>1</w:t>
+              <w:t>4</w:t>
             </w:r>
             <w:r>
               <w:rPr>
@@ -2058,7 +2058,7 @@
               <w:lang w:eastAsia="fr-CH"/>
             </w:rPr>
           </w:pPr>
-          <w:hyperlink w:anchor="_Toc241053692" w:history="1">
+          <w:hyperlink w:anchor="_Toc241054946" w:history="1">
             <w:r>
               <w:rPr>
                 <w:rStyle w:val="Lienhypertexte"/>
@@ -2088,7 +2088,7 @@
                 <w:noProof/>
                 <w:webHidden/>
               </w:rPr>
-              <w:instrText xml:space="preserve"> PAGEREF _Toc241053692 \h </w:instrText>
+              <w:instrText xml:space="preserve"> PAGEREF _Toc241054946 \h </w:instrText>
             </w:r>
             <w:r>
               <w:rPr>
@@ -2108,7 +2108,7 @@
                 <w:noProof/>
                 <w:webHidden/>
               </w:rPr>
-              <w:t>1</w:t>
+              <w:t>5</w:t>
             </w:r>
             <w:r>
               <w:rPr>
@@ -2131,7 +2131,7 @@
               <w:lang w:eastAsia="fr-CH"/>
             </w:rPr>
           </w:pPr>
-          <w:hyperlink w:anchor="_Toc241053693" w:history="1">
+          <w:hyperlink w:anchor="_Toc241054947" w:history="1">
             <w:r>
               <w:rPr>
                 <w:rStyle w:val="Lienhypertexte"/>
@@ -2161,7 +2161,7 @@
                 <w:noProof/>
                 <w:webHidden/>
               </w:rPr>
-              <w:instrText xml:space="preserve"> PAGEREF _Toc241053693 \h </w:instrText>
+              <w:instrText xml:space="preserve"> PAGEREF _Toc241054947 \h </w:instrText>
             </w:r>
             <w:r>
               <w:rPr>
@@ -2181,7 +2181,7 @@
                 <w:noProof/>
                 <w:webHidden/>
               </w:rPr>
-              <w:t>1</w:t>
+              <w:t>6</w:t>
             </w:r>
             <w:r>
               <w:rPr>
@@ -2204,7 +2204,7 @@
               <w:lang w:eastAsia="fr-CH"/>
             </w:rPr>
           </w:pPr>
-          <w:hyperlink w:anchor="_Toc241053694" w:history="1">
+          <w:hyperlink w:anchor="_Toc241054948" w:history="1">
             <w:r>
               <w:rPr>
                 <w:rStyle w:val="Lienhypertexte"/>
@@ -2234,7 +2234,7 @@
                 <w:noProof/>
                 <w:webHidden/>
               </w:rPr>
-              <w:instrText xml:space="preserve"> PAGEREF _Toc241053694 \h </w:instrText>
+              <w:instrText xml:space="preserve"> PAGEREF _Toc241054948 \h </w:instrText>
             </w:r>
             <w:r>
               <w:rPr>
@@ -2254,7 +2254,7 @@
                 <w:noProof/>
                 <w:webHidden/>
               </w:rPr>
-              <w:t>1</w:t>
+              <w:t>7</w:t>
             </w:r>
             <w:r>
               <w:rPr>
@@ -2277,7 +2277,7 @@
               <w:lang w:eastAsia="fr-CH"/>
             </w:rPr>
           </w:pPr>
-          <w:hyperlink w:anchor="_Toc241053695" w:history="1">
+          <w:hyperlink w:anchor="_Toc241054949" w:history="1">
             <w:r>
               <w:rPr>
                 <w:rStyle w:val="Lienhypertexte"/>
@@ -2307,7 +2307,7 @@
                 <w:noProof/>
                 <w:webHidden/>
               </w:rPr>
-              <w:instrText xml:space="preserve"> PAGEREF _Toc241053695 \h </w:instrText>
+              <w:instrText xml:space="preserve"> PAGEREF _Toc241054949 \h </w:instrText>
             </w:r>
             <w:r>
               <w:rPr>
@@ -2327,7 +2327,7 @@
                 <w:noProof/>
                 <w:webHidden/>
               </w:rPr>
-              <w:t>1</w:t>
+              <w:t>8</w:t>
             </w:r>
             <w:r>
               <w:rPr>
@@ -2350,7 +2350,7 @@
               <w:lang w:eastAsia="fr-CH"/>
             </w:rPr>
           </w:pPr>
-          <w:hyperlink w:anchor="_Toc241053696" w:history="1">
+          <w:hyperlink w:anchor="_Toc241054950" w:history="1">
             <w:r>
               <w:rPr>
                 <w:rStyle w:val="Lienhypertexte"/>
@@ -2380,7 +2380,7 @@
                 <w:noProof/>
                 <w:webHidden/>
               </w:rPr>
-              <w:instrText xml:space="preserve"> PAGEREF _Toc241053696 \h </w:instrText>
+              <w:instrText xml:space="preserve"> PAGEREF _Toc241054950 \h </w:instrText>
             </w:r>
             <w:r>
               <w:rPr>
@@ -2400,7 +2400,7 @@
                 <w:noProof/>
                 <w:webHidden/>
               </w:rPr>
-              <w:t>1</w:t>
+              <w:t>9</w:t>
             </w:r>
             <w:r>
               <w:rPr>
@@ -2423,7 +2423,7 @@
               <w:lang w:eastAsia="fr-CH"/>
             </w:rPr>
           </w:pPr>
-          <w:hyperlink w:anchor="_Toc241053697" w:history="1">
+          <w:hyperlink w:anchor="_Toc241054951" w:history="1">
             <w:r>
               <w:rPr>
                 <w:rStyle w:val="Lienhypertexte"/>
@@ -2453,7 +2453,7 @@
                 <w:noProof/>
                 <w:webHidden/>
               </w:rPr>
-              <w:instrText xml:space="preserve"> PAGEREF _Toc241053697 \h </w:instrText>
+              <w:instrText xml:space="preserve"> PAGEREF _Toc241054951 \h </w:instrText>
             </w:r>
             <w:r>
               <w:rPr>
@@ -2473,7 +2473,7 @@
                 <w:noProof/>
                 <w:webHidden/>
               </w:rPr>
-              <w:t>1</w:t>
+              <w:t>10</w:t>
             </w:r>
             <w:r>
               <w:rPr>
@@ -2494,7 +2494,7 @@
               <w:lang w:eastAsia="fr-CH"/>
             </w:rPr>
           </w:pPr>
-          <w:hyperlink w:anchor="_Toc241053698" w:history="1">
+          <w:hyperlink w:anchor="_Toc241054952" w:history="1">
             <w:r>
               <w:rPr>
                 <w:rStyle w:val="Lienhypertexte"/>
@@ -2518,7 +2518,7 @@
               <w:rPr>
                 <w:webHidden/>
               </w:rPr>
-              <w:instrText xml:space="preserve"> PAGEREF _Toc241053698 \h </w:instrText>
+              <w:instrText xml:space="preserve"> PAGEREF _Toc241054952 \h </w:instrText>
             </w:r>
             <w:r>
               <w:rPr>
@@ -2535,7 +2535,7 @@
               <w:rPr>
                 <w:webHidden/>
               </w:rPr>
-              <w:t>1</w:t>
+              <w:t>10</w:t>
             </w:r>
             <w:r>
               <w:rPr>
@@ -2555,7 +2555,7 @@
               <w:lang w:eastAsia="fr-CH"/>
             </w:rPr>
           </w:pPr>
-          <w:hyperlink w:anchor="_Toc241053699" w:history="1">
+          <w:hyperlink w:anchor="_Toc241054953" w:history="1">
             <w:r>
               <w:rPr>
                 <w:rStyle w:val="Lienhypertexte"/>
@@ -2579,7 +2579,7 @@
               <w:rPr>
                 <w:webHidden/>
               </w:rPr>
-              <w:instrText xml:space="preserve"> PAGEREF _Toc241053699 \h </w:instrText>
+              <w:instrText xml:space="preserve"> PAGEREF _Toc241054953 \h </w:instrText>
             </w:r>
             <w:r>
               <w:rPr>
@@ -2596,7 +2596,7 @@
               <w:rPr>
                 <w:webHidden/>
               </w:rPr>
-              <w:t>1</w:t>
+              <w:t>11</w:t>
             </w:r>
             <w:r>
               <w:rPr>
@@ -2616,7 +2616,7 @@
               <w:lang w:eastAsia="fr-CH"/>
             </w:rPr>
           </w:pPr>
-          <w:hyperlink w:anchor="_Toc241053700" w:history="1">
+          <w:hyperlink w:anchor="_Toc241054954" w:history="1">
             <w:r>
               <w:rPr>
                 <w:rStyle w:val="Lienhypertexte"/>
@@ -2640,7 +2640,7 @@
               <w:rPr>
                 <w:webHidden/>
               </w:rPr>
-              <w:instrText xml:space="preserve"> PAGEREF _Toc241053700 \h </w:instrText>
+              <w:instrText xml:space="preserve"> PAGEREF _Toc241054954 \h </w:instrText>
             </w:r>
             <w:r>
               <w:rPr>
@@ -2657,7 +2657,7 @@
               <w:rPr>
                 <w:webHidden/>
               </w:rPr>
-              <w:t>1</w:t>
+              <w:t>12</w:t>
             </w:r>
             <w:r>
               <w:rPr>
@@ -2677,7 +2677,7 @@
               <w:lang w:eastAsia="fr-CH"/>
             </w:rPr>
           </w:pPr>
-          <w:hyperlink w:anchor="_Toc241053701" w:history="1">
+          <w:hyperlink w:anchor="_Toc241054955" w:history="1">
             <w:r>
               <w:rPr>
                 <w:rStyle w:val="Lienhypertexte"/>
@@ -2701,7 +2701,7 @@
               <w:rPr>
                 <w:webHidden/>
               </w:rPr>
-              <w:instrText xml:space="preserve"> PAGEREF _Toc241053701 \h </w:instrText>
+              <w:instrText xml:space="preserve"> PAGEREF _Toc241054955 \h </w:instrText>
             </w:r>
             <w:r>
               <w:rPr>
@@ -2718,7 +2718,7 @@
               <w:rPr>
                 <w:webHidden/>
               </w:rPr>
-              <w:t>1</w:t>
+              <w:t>13</w:t>
             </w:r>
             <w:r>
               <w:rPr>
@@ -2845,7 +2845,7 @@
           <w:bCs/>
         </w:rPr>
       </w:pPr>
-      <w:bookmarkStart w:id="0" w:name="_Toc241053688"/>
+      <w:bookmarkStart w:id="0" w:name="_Toc241054942"/>
       <w:r>
         <w:rPr>
           <w:rFonts w:ascii="Calibri" w:hAnsi="Calibri" w:cs="Calibri"/>
@@ -2912,7 +2912,7 @@
           <w:bCs/>
         </w:rPr>
       </w:pPr>
-      <w:bookmarkStart w:id="1" w:name="_Toc241053689"/>
+      <w:bookmarkStart w:id="1" w:name="_Toc241054943"/>
       <w:r>
         <w:rPr>
           <w:rFonts w:ascii="Calibri" w:hAnsi="Calibri" w:cs="Calibri"/>
@@ -2933,6 +2933,745 @@
     </w:p>
     <w:p>
       <w:pPr>
+        <w:ind w:left="426"/>
+        <w:jc w:val="both"/>
+        <w:rPr>
+          <w:rFonts w:ascii="Calibri" w:hAnsi="Calibri" w:cs="Calibri"/>
+        </w:rPr>
+      </w:pPr>
+      <w:r>
+        <w:rPr>
+          <w:rFonts w:ascii="Calibri" w:hAnsi="Calibri" w:cs="Calibri"/>
+        </w:rPr>
+        <w:t>L’aéroport international SkyConnect repose sur une infrastructure complexe qui permet d’assurer un suivi rigoureux des vols et des passagers. Pour garantir une gestion fluide des opérations, un système de gestion de bases de données a été conçu. Ce système repose sur</w:t>
+      </w:r>
+      <w:r>
+        <w:rPr>
+          <w:rFonts w:ascii="Calibri" w:hAnsi="Calibri" w:cs="Calibri"/>
+        </w:rPr>
+        <w:t xml:space="preserve"> </w:t>
+      </w:r>
+      <w:r>
+        <w:rPr>
+          <w:rFonts w:ascii="Calibri" w:hAnsi="Calibri" w:cs="Calibri"/>
+        </w:rPr>
+        <w:t>plusieurs concepts clés permettant d’optimiser l’exploitation des ressources aéroportuaires et</w:t>
+      </w:r>
+      <w:r>
+        <w:rPr>
+          <w:rFonts w:ascii="Calibri" w:hAnsi="Calibri" w:cs="Calibri"/>
+        </w:rPr>
+        <w:t xml:space="preserve"> </w:t>
+      </w:r>
+      <w:r>
+        <w:rPr>
+          <w:rFonts w:ascii="Calibri" w:hAnsi="Calibri" w:cs="Calibri"/>
+        </w:rPr>
+        <w:t>d’assurer la coordination entre les différents acteurs du transport aérien.</w:t>
+      </w:r>
+    </w:p>
+    <w:p>
+      <w:pPr>
+        <w:ind w:left="426"/>
+        <w:jc w:val="both"/>
+        <w:rPr>
+          <w:rFonts w:ascii="Calibri" w:hAnsi="Calibri" w:cs="Calibri"/>
+        </w:rPr>
+      </w:pPr>
+      <w:r>
+        <w:rPr>
+          <w:rFonts w:ascii="Calibri" w:hAnsi="Calibri" w:cs="Calibri"/>
+        </w:rPr>
+        <w:t>Le premier élément fondamental est la gestion des aéroports. Chaque aéroport du monde</w:t>
+      </w:r>
+      <w:r>
+        <w:rPr>
+          <w:rFonts w:ascii="Calibri" w:hAnsi="Calibri" w:cs="Calibri"/>
+        </w:rPr>
+        <w:t xml:space="preserve"> </w:t>
+      </w:r>
+      <w:r>
+        <w:rPr>
+          <w:rFonts w:ascii="Calibri" w:hAnsi="Calibri" w:cs="Calibri"/>
+        </w:rPr>
+        <w:t xml:space="preserve">est identifié par deux codes :  </w:t>
+      </w:r>
+    </w:p>
+    <w:p>
+      <w:pPr>
+        <w:pStyle w:val="Paragraphedeliste"/>
+        <w:numPr>
+          <w:ilvl w:val="0"/>
+          <w:numId w:val="29"/>
+        </w:numPr>
+        <w:jc w:val="both"/>
+        <w:rPr>
+          <w:rFonts w:ascii="Calibri" w:hAnsi="Calibri" w:cs="Calibri"/>
+        </w:rPr>
+      </w:pPr>
+      <w:r>
+        <w:rPr>
+          <w:rFonts w:ascii="Calibri" w:hAnsi="Calibri" w:cs="Calibri"/>
+        </w:rPr>
+        <w:t>Le</w:t>
+      </w:r>
+      <w:r>
+        <w:rPr>
+          <w:rFonts w:ascii="Calibri" w:hAnsi="Calibri" w:cs="Calibri"/>
+        </w:rPr>
+        <w:t xml:space="preserve"> code IATA, composé de trois lettres et utilisé par les passagers et les compagnies</w:t>
+      </w:r>
+      <w:r>
+        <w:rPr>
+          <w:rFonts w:ascii="Calibri" w:hAnsi="Calibri" w:cs="Calibri"/>
+        </w:rPr>
+        <w:t xml:space="preserve"> </w:t>
+      </w:r>
+      <w:r>
+        <w:rPr>
+          <w:rFonts w:ascii="Calibri" w:hAnsi="Calibri" w:cs="Calibri"/>
+        </w:rPr>
+        <w:t xml:space="preserve">aériennes pour identifier facilement un aéroport (comme CDG pour Paris Charles de Gaulle). Ce code n’est pas unique. </w:t>
+      </w:r>
+    </w:p>
+    <w:p>
+      <w:pPr>
+        <w:pStyle w:val="Paragraphedeliste"/>
+        <w:numPr>
+          <w:ilvl w:val="0"/>
+          <w:numId w:val="29"/>
+        </w:numPr>
+        <w:jc w:val="both"/>
+        <w:rPr>
+          <w:rFonts w:ascii="Calibri" w:hAnsi="Calibri" w:cs="Calibri"/>
+        </w:rPr>
+      </w:pPr>
+      <w:r>
+        <w:rPr>
+          <w:rFonts w:ascii="Calibri" w:hAnsi="Calibri" w:cs="Calibri"/>
+        </w:rPr>
+        <w:t>Le</w:t>
+      </w:r>
+      <w:r>
+        <w:rPr>
+          <w:rFonts w:ascii="Calibri" w:hAnsi="Calibri" w:cs="Calibri"/>
+        </w:rPr>
+        <w:t xml:space="preserve"> code ICAO, composé de quatre lettres et utilisé principalement par les systèmes de navigation aérienne et les contrôleurs du trafic aérien (comme LFPG pour CDG). Ce code est unique. </w:t>
+      </w:r>
+    </w:p>
+    <w:p>
+      <w:pPr>
+        <w:ind w:left="426"/>
+        <w:jc w:val="both"/>
+        <w:rPr>
+          <w:rFonts w:ascii="Calibri" w:hAnsi="Calibri" w:cs="Calibri"/>
+        </w:rPr>
+      </w:pPr>
+      <w:r>
+        <w:rPr>
+          <w:rFonts w:ascii="Calibri" w:hAnsi="Calibri" w:cs="Calibri"/>
+        </w:rPr>
+        <w:t>Ces codes permettent d’éviter toute confusion et d’uniformiser la communication à l’échelle internationale. Chaque aéroport enregistré dans le système possède un nom officiel, qui est utilisé dans les rapports et les documents administratifs.</w:t>
+      </w:r>
+    </w:p>
+    <w:p>
+      <w:pPr>
+        <w:ind w:left="426"/>
+        <w:jc w:val="both"/>
+        <w:rPr>
+          <w:rFonts w:ascii="Calibri" w:hAnsi="Calibri" w:cs="Calibri"/>
+        </w:rPr>
+      </w:pPr>
+      <w:r>
+        <w:rPr>
+          <w:rFonts w:ascii="Calibri" w:hAnsi="Calibri" w:cs="Calibri"/>
+        </w:rPr>
+        <w:t>Les compagnies aériennes sont les acteurs principaux du transport aérien. Elles possèdent un code IATA à deux lettres, leur permettant d’être identifiées rapidement dans les billets d’avion et les systèmes de réservation (par exemple, AF pour Air France ou LH pour Lufthansa). Chaque compagnie est enregistrée sous son nom officiel et est associée à un aéroport principal, qui est sa base d’opérations. Cette information est essentielle car elle permet de savoir où une compagnie entretient ses avions et où se situent ses centres de maintenance.</w:t>
+      </w:r>
+    </w:p>
+    <w:p>
+      <w:pPr>
+        <w:ind w:left="426"/>
+        <w:jc w:val="both"/>
+        <w:rPr>
+          <w:rFonts w:ascii="Calibri" w:hAnsi="Calibri" w:cs="Calibri"/>
+        </w:rPr>
+      </w:pPr>
+      <w:r>
+        <w:rPr>
+          <w:rFonts w:ascii="Calibri" w:hAnsi="Calibri" w:cs="Calibri"/>
+        </w:rPr>
+        <w:lastRenderedPageBreak/>
+        <w:t>Les compagnies aériennes exploitent une flotte d’avions, qui sont des appareils spécifiques possédant des caractéristiques bien définies. Chaque avion appartient à une compagnie aérienne et est définit par un type d’avion. Par exemple, un Airbus A320 et un Boeing 747 sont deux types d’avions distincts. Le type d’avion définit un modèle générique et possède une description détaillée. La capacité d’un avion peut être différente entre deux mêmes modèles d’avion. Lorsqu’un avion est ajouté au système, il est associé à un type d’avion et à une compagnie, ce qui permet de suivre précisément quel appareil appartient à quelle entreprise et de planifier son utilisation.</w:t>
+      </w:r>
+    </w:p>
+    <w:p>
+      <w:pPr>
+        <w:ind w:left="426"/>
+        <w:jc w:val="both"/>
+        <w:rPr>
+          <w:rFonts w:ascii="Calibri" w:hAnsi="Calibri" w:cs="Calibri"/>
+        </w:rPr>
+      </w:pPr>
+      <w:r>
+        <w:rPr>
+          <w:rFonts w:ascii="Calibri" w:hAnsi="Calibri" w:cs="Calibri"/>
+        </w:rPr>
+        <w:t>Un des éléments essentiels de la gestion du trafic aérien est la planification des vols. Il est</w:t>
+      </w:r>
+      <w:r>
+        <w:rPr>
+          <w:rFonts w:ascii="Calibri" w:hAnsi="Calibri" w:cs="Calibri"/>
+        </w:rPr>
+        <w:t xml:space="preserve"> </w:t>
+      </w:r>
+      <w:r>
+        <w:rPr>
+          <w:rFonts w:ascii="Calibri" w:hAnsi="Calibri" w:cs="Calibri"/>
+        </w:rPr>
+        <w:t>important de bien comprendre la distinction entre un programme de vol et un vol réel.</w:t>
+      </w:r>
+    </w:p>
+    <w:p>
+      <w:pPr>
+        <w:ind w:left="426"/>
+        <w:jc w:val="both"/>
+        <w:rPr>
+          <w:rFonts w:ascii="Calibri" w:hAnsi="Calibri" w:cs="Calibri"/>
+        </w:rPr>
+      </w:pPr>
+      <w:r>
+        <w:rPr>
+          <w:rFonts w:ascii="Calibri" w:hAnsi="Calibri" w:cs="Calibri"/>
+        </w:rPr>
+        <w:t>Un programme de vol est une planification régulière qui définit quels vols doivent être opérés à quelles dates et à quels horaires. Par exemple, le vol AF001 entre Paris et New York peut être programmé tous les lundis, mercredis et vendredis à 10h00.</w:t>
+      </w:r>
+    </w:p>
+    <w:p>
+      <w:pPr>
+        <w:ind w:left="426"/>
+        <w:jc w:val="both"/>
+        <w:rPr>
+          <w:rFonts w:ascii="Calibri" w:hAnsi="Calibri" w:cs="Calibri"/>
+        </w:rPr>
+      </w:pPr>
+      <w:r>
+        <w:rPr>
+          <w:rFonts w:ascii="Calibri" w:hAnsi="Calibri" w:cs="Calibri"/>
+        </w:rPr>
+        <w:t>Un programme de vol n’a pas d’avion attribué à l’avance. Il s'agit d'un plan, qui ne dépend pas d'un avion précis.</w:t>
+      </w:r>
+    </w:p>
+    <w:p>
+      <w:pPr>
+        <w:ind w:left="426"/>
+        <w:jc w:val="both"/>
+        <w:rPr>
+          <w:rFonts w:ascii="Calibri" w:hAnsi="Calibri" w:cs="Calibri"/>
+        </w:rPr>
+      </w:pPr>
+      <w:r>
+        <w:rPr>
+          <w:rFonts w:ascii="Calibri" w:hAnsi="Calibri" w:cs="Calibri"/>
+        </w:rPr>
+        <w:t xml:space="preserve">Un programme de vol est une règle générale qui définit :  </w:t>
+      </w:r>
+    </w:p>
+    <w:p>
+      <w:pPr>
+        <w:pStyle w:val="Paragraphedeliste"/>
+        <w:numPr>
+          <w:ilvl w:val="0"/>
+          <w:numId w:val="30"/>
+        </w:numPr>
+        <w:jc w:val="both"/>
+        <w:rPr>
+          <w:rFonts w:ascii="Calibri" w:hAnsi="Calibri" w:cs="Calibri"/>
+        </w:rPr>
+      </w:pPr>
+      <w:r>
+        <w:rPr>
+          <w:rFonts w:ascii="Calibri" w:hAnsi="Calibri" w:cs="Calibri"/>
+        </w:rPr>
+        <w:t xml:space="preserve">Une route aérienne (départ &amp; arrivée). </w:t>
+      </w:r>
+    </w:p>
+    <w:p>
+      <w:pPr>
+        <w:pStyle w:val="Paragraphedeliste"/>
+        <w:numPr>
+          <w:ilvl w:val="0"/>
+          <w:numId w:val="30"/>
+        </w:numPr>
+        <w:jc w:val="both"/>
+        <w:rPr>
+          <w:rFonts w:ascii="Calibri" w:hAnsi="Calibri" w:cs="Calibri"/>
+        </w:rPr>
+      </w:pPr>
+      <w:r>
+        <w:rPr>
+          <w:rFonts w:ascii="Calibri" w:hAnsi="Calibri" w:cs="Calibri"/>
+        </w:rPr>
+        <w:t xml:space="preserve">Une fréquence (jours de la semaine). </w:t>
+      </w:r>
+    </w:p>
+    <w:p>
+      <w:pPr>
+        <w:pStyle w:val="Paragraphedeliste"/>
+        <w:numPr>
+          <w:ilvl w:val="0"/>
+          <w:numId w:val="30"/>
+        </w:numPr>
+        <w:jc w:val="both"/>
+        <w:rPr>
+          <w:rFonts w:ascii="Calibri" w:hAnsi="Calibri" w:cs="Calibri"/>
+        </w:rPr>
+      </w:pPr>
+      <w:r>
+        <w:rPr>
+          <w:rFonts w:ascii="Calibri" w:hAnsi="Calibri" w:cs="Calibri"/>
+        </w:rPr>
+        <w:t xml:space="preserve">Des horaires prévus. </w:t>
+      </w:r>
+    </w:p>
+    <w:p>
+      <w:pPr>
+        <w:pStyle w:val="Paragraphedeliste"/>
+        <w:numPr>
+          <w:ilvl w:val="0"/>
+          <w:numId w:val="30"/>
+        </w:numPr>
+        <w:jc w:val="both"/>
+        <w:rPr>
+          <w:rFonts w:ascii="Calibri" w:hAnsi="Calibri" w:cs="Calibri"/>
+        </w:rPr>
+      </w:pPr>
+      <w:r>
+        <w:rPr>
+          <w:rFonts w:ascii="Calibri" w:hAnsi="Calibri" w:cs="Calibri"/>
+        </w:rPr>
+        <w:t>Une compagnie exploitante.</w:t>
+      </w:r>
+    </w:p>
+    <w:p>
+      <w:pPr>
+        <w:ind w:left="426"/>
+        <w:jc w:val="both"/>
+        <w:rPr>
+          <w:rFonts w:ascii="Calibri" w:hAnsi="Calibri" w:cs="Calibri"/>
+          <w:u w:val="single"/>
+        </w:rPr>
+      </w:pPr>
+      <w:r>
+        <w:rPr>
+          <w:rFonts w:ascii="Calibri" w:hAnsi="Calibri" w:cs="Calibri"/>
+          <w:u w:val="single"/>
+        </w:rPr>
+        <w:t>Exemple :</w:t>
+      </w:r>
+    </w:p>
+    <w:p>
+      <w:pPr>
+        <w:spacing w:line="240" w:lineRule="auto"/>
+        <w:ind w:left="426"/>
+        <w:jc w:val="both"/>
+        <w:rPr>
+          <w:rFonts w:ascii="Calibri" w:hAnsi="Calibri" w:cs="Calibri"/>
+        </w:rPr>
+      </w:pPr>
+      <w:r>
+        <w:rPr>
+          <w:rFonts w:ascii="Calibri" w:hAnsi="Calibri" w:cs="Calibri"/>
+        </w:rPr>
+        <w:t xml:space="preserve">Air France programme un vol entre Paris et New York. </w:t>
+      </w:r>
+    </w:p>
+    <w:p>
+      <w:pPr>
+        <w:spacing w:line="240" w:lineRule="auto"/>
+        <w:ind w:left="426"/>
+        <w:jc w:val="both"/>
+        <w:rPr>
+          <w:rFonts w:ascii="Calibri" w:hAnsi="Calibri" w:cs="Calibri"/>
+        </w:rPr>
+      </w:pPr>
+      <w:r>
+        <w:rPr>
+          <w:rFonts w:ascii="Calibri" w:hAnsi="Calibri" w:cs="Calibri"/>
+        </w:rPr>
+        <w:t xml:space="preserve">AF001 : CDG → JFK </w:t>
+      </w:r>
+    </w:p>
+    <w:p>
+      <w:pPr>
+        <w:spacing w:line="240" w:lineRule="auto"/>
+        <w:ind w:left="426"/>
+        <w:jc w:val="both"/>
+        <w:rPr>
+          <w:rFonts w:ascii="Calibri" w:hAnsi="Calibri" w:cs="Calibri"/>
+        </w:rPr>
+      </w:pPr>
+      <w:r>
+        <w:rPr>
+          <w:rFonts w:ascii="Calibri" w:hAnsi="Calibri" w:cs="Calibri"/>
+        </w:rPr>
+        <w:t xml:space="preserve">Départ prévu : 10h00 </w:t>
+      </w:r>
+    </w:p>
+    <w:p>
+      <w:pPr>
+        <w:spacing w:line="240" w:lineRule="auto"/>
+        <w:ind w:left="426"/>
+        <w:jc w:val="both"/>
+        <w:rPr>
+          <w:rFonts w:ascii="Calibri" w:hAnsi="Calibri" w:cs="Calibri"/>
+        </w:rPr>
+      </w:pPr>
+      <w:r>
+        <w:rPr>
+          <w:rFonts w:ascii="Calibri" w:hAnsi="Calibri" w:cs="Calibri"/>
+        </w:rPr>
+        <w:t xml:space="preserve">Opéré tous les : Lundi, Mercredi, Vendredi </w:t>
+      </w:r>
+    </w:p>
+    <w:p>
+      <w:pPr>
+        <w:spacing w:line="240" w:lineRule="auto"/>
+        <w:ind w:left="426"/>
+        <w:jc w:val="both"/>
+        <w:rPr>
+          <w:rFonts w:ascii="Calibri" w:hAnsi="Calibri" w:cs="Calibri"/>
+        </w:rPr>
+      </w:pPr>
+      <w:r>
+        <w:rPr>
+          <w:rFonts w:ascii="Calibri" w:hAnsi="Calibri" w:cs="Calibri"/>
+        </w:rPr>
+        <w:t xml:space="preserve">Aucun avion n’est attribué à l’avance. </w:t>
+      </w:r>
+    </w:p>
+    <w:p>
+      <w:pPr>
+        <w:spacing w:line="240" w:lineRule="auto"/>
+        <w:ind w:left="426"/>
+        <w:jc w:val="both"/>
+        <w:rPr>
+          <w:rFonts w:ascii="Calibri" w:hAnsi="Calibri" w:cs="Calibri"/>
+        </w:rPr>
+      </w:pPr>
+      <w:r>
+        <w:rPr>
+          <w:rFonts w:ascii="Calibri" w:hAnsi="Calibri" w:cs="Calibri"/>
+        </w:rPr>
+        <w:t xml:space="preserve">Ce programme existe avant même qu’un avion soit affecté à un vol précis. </w:t>
+      </w:r>
+    </w:p>
+    <w:p>
+      <w:pPr>
+        <w:ind w:left="426"/>
+        <w:jc w:val="both"/>
+        <w:rPr>
+          <w:rFonts w:ascii="Calibri" w:hAnsi="Calibri" w:cs="Calibri"/>
+        </w:rPr>
+      </w:pPr>
+      <w:r>
+        <w:rPr>
+          <w:rFonts w:ascii="Calibri" w:hAnsi="Calibri" w:cs="Calibri"/>
+        </w:rPr>
+        <w:t xml:space="preserve">Chaque vol réel suit un programme, mais il est lié à :  </w:t>
+      </w:r>
+    </w:p>
+    <w:p>
+      <w:pPr>
+        <w:pStyle w:val="Paragraphedeliste"/>
+        <w:numPr>
+          <w:ilvl w:val="0"/>
+          <w:numId w:val="31"/>
+        </w:numPr>
+        <w:jc w:val="both"/>
+        <w:rPr>
+          <w:rFonts w:ascii="Calibri" w:hAnsi="Calibri" w:cs="Calibri"/>
+        </w:rPr>
+      </w:pPr>
+      <w:r>
+        <w:rPr>
+          <w:rFonts w:ascii="Calibri" w:hAnsi="Calibri" w:cs="Calibri"/>
+        </w:rPr>
+        <w:t xml:space="preserve">Un jour précis. </w:t>
+      </w:r>
+    </w:p>
+    <w:p>
+      <w:pPr>
+        <w:pStyle w:val="Paragraphedeliste"/>
+        <w:numPr>
+          <w:ilvl w:val="0"/>
+          <w:numId w:val="31"/>
+        </w:numPr>
+        <w:jc w:val="both"/>
+        <w:rPr>
+          <w:rFonts w:ascii="Calibri" w:hAnsi="Calibri" w:cs="Calibri"/>
+        </w:rPr>
+      </w:pPr>
+      <w:r>
+        <w:rPr>
+          <w:rFonts w:ascii="Calibri" w:hAnsi="Calibri" w:cs="Calibri"/>
+        </w:rPr>
+        <w:t xml:space="preserve">Un avion spécifique. </w:t>
+      </w:r>
+    </w:p>
+    <w:p>
+      <w:pPr>
+        <w:pStyle w:val="Paragraphedeliste"/>
+        <w:numPr>
+          <w:ilvl w:val="0"/>
+          <w:numId w:val="31"/>
+        </w:numPr>
+        <w:jc w:val="both"/>
+        <w:rPr>
+          <w:rFonts w:ascii="Calibri" w:hAnsi="Calibri" w:cs="Calibri"/>
+        </w:rPr>
+      </w:pPr>
+      <w:r>
+        <w:rPr>
+          <w:rFonts w:ascii="Calibri" w:hAnsi="Calibri" w:cs="Calibri"/>
+        </w:rPr>
+        <w:t>Un horaire réel de départ et d’arrivée.</w:t>
+      </w:r>
+    </w:p>
+    <w:p>
+      <w:pPr>
+        <w:pStyle w:val="Paragraphedeliste"/>
+        <w:ind w:left="1146"/>
+        <w:jc w:val="both"/>
+        <w:rPr>
+          <w:rFonts w:ascii="Calibri" w:hAnsi="Calibri" w:cs="Calibri"/>
+        </w:rPr>
+      </w:pPr>
+    </w:p>
+    <w:p>
+      <w:pPr>
+        <w:pStyle w:val="Paragraphedeliste"/>
+        <w:ind w:left="1146"/>
+        <w:jc w:val="both"/>
+        <w:rPr>
+          <w:rFonts w:ascii="Calibri" w:hAnsi="Calibri" w:cs="Calibri"/>
+        </w:rPr>
+      </w:pPr>
+    </w:p>
+    <w:p>
+      <w:pPr>
+        <w:pStyle w:val="Paragraphedeliste"/>
+        <w:ind w:left="1146"/>
+        <w:jc w:val="both"/>
+        <w:rPr>
+          <w:rFonts w:ascii="Calibri" w:hAnsi="Calibri" w:cs="Calibri"/>
+        </w:rPr>
+      </w:pPr>
+    </w:p>
+    <w:p>
+      <w:pPr>
+        <w:ind w:left="426"/>
+        <w:jc w:val="both"/>
+        <w:rPr>
+          <w:rFonts w:ascii="Calibri" w:hAnsi="Calibri" w:cs="Calibri"/>
+          <w:u w:val="single"/>
+        </w:rPr>
+      </w:pPr>
+      <w:r>
+        <w:rPr>
+          <w:rFonts w:ascii="Calibri" w:hAnsi="Calibri" w:cs="Calibri"/>
+          <w:u w:val="single"/>
+        </w:rPr>
+        <w:lastRenderedPageBreak/>
+        <w:t>Exemple :</w:t>
+      </w:r>
+    </w:p>
+    <w:p>
+      <w:pPr>
+        <w:spacing w:line="240" w:lineRule="auto"/>
+        <w:ind w:left="426"/>
+        <w:jc w:val="both"/>
+        <w:rPr>
+          <w:rFonts w:ascii="Calibri" w:hAnsi="Calibri" w:cs="Calibri"/>
+        </w:rPr>
+      </w:pPr>
+      <w:r>
+        <w:rPr>
+          <w:rFonts w:ascii="Calibri" w:hAnsi="Calibri" w:cs="Calibri"/>
+        </w:rPr>
+        <w:t xml:space="preserve">Le vol AF001 du 12 juin 2025 a été opéré. </w:t>
+      </w:r>
+    </w:p>
+    <w:p>
+      <w:pPr>
+        <w:spacing w:line="240" w:lineRule="auto"/>
+        <w:ind w:left="426"/>
+        <w:jc w:val="both"/>
+        <w:rPr>
+          <w:rFonts w:ascii="Calibri" w:hAnsi="Calibri" w:cs="Calibri"/>
+        </w:rPr>
+      </w:pPr>
+      <w:r>
+        <w:rPr>
+          <w:rFonts w:ascii="Calibri" w:hAnsi="Calibri" w:cs="Calibri"/>
+        </w:rPr>
+        <w:t>Avion : Airbus A380 immatriculé F-HPJA</w:t>
+      </w:r>
+    </w:p>
+    <w:p>
+      <w:pPr>
+        <w:spacing w:line="240" w:lineRule="auto"/>
+        <w:ind w:left="426"/>
+        <w:jc w:val="both"/>
+        <w:rPr>
+          <w:rFonts w:ascii="Calibri" w:hAnsi="Calibri" w:cs="Calibri"/>
+        </w:rPr>
+      </w:pPr>
+      <w:r>
+        <w:rPr>
+          <w:rFonts w:ascii="Calibri" w:hAnsi="Calibri" w:cs="Calibri"/>
+        </w:rPr>
+        <w:t>Départ réel : 10h05</w:t>
+      </w:r>
+    </w:p>
+    <w:p>
+      <w:pPr>
+        <w:spacing w:line="240" w:lineRule="auto"/>
+        <w:ind w:left="426"/>
+        <w:jc w:val="both"/>
+        <w:rPr>
+          <w:rFonts w:ascii="Calibri" w:hAnsi="Calibri" w:cs="Calibri"/>
+        </w:rPr>
+      </w:pPr>
+      <w:r>
+        <w:rPr>
+          <w:rFonts w:ascii="Calibri" w:hAnsi="Calibri" w:cs="Calibri"/>
+        </w:rPr>
+        <w:t xml:space="preserve">Arrivée réelle : 13h15 </w:t>
+      </w:r>
+    </w:p>
+    <w:p>
+      <w:pPr>
+        <w:spacing w:line="240" w:lineRule="auto"/>
+        <w:ind w:left="426"/>
+        <w:jc w:val="both"/>
+        <w:rPr>
+          <w:rFonts w:ascii="Calibri" w:hAnsi="Calibri" w:cs="Calibri"/>
+        </w:rPr>
+      </w:pPr>
+      <w:r>
+        <w:rPr>
+          <w:rFonts w:ascii="Calibri" w:hAnsi="Calibri" w:cs="Calibri"/>
+        </w:rPr>
+        <w:t xml:space="preserve">Compagnie exploitante : Air France </w:t>
+      </w:r>
+    </w:p>
+    <w:p>
+      <w:pPr>
+        <w:spacing w:line="240" w:lineRule="auto"/>
+        <w:ind w:left="426"/>
+        <w:jc w:val="both"/>
+        <w:rPr>
+          <w:rFonts w:ascii="Calibri" w:hAnsi="Calibri" w:cs="Calibri"/>
+        </w:rPr>
+      </w:pPr>
+      <w:r>
+        <w:rPr>
+          <w:rFonts w:ascii="Calibri" w:hAnsi="Calibri" w:cs="Calibri"/>
+        </w:rPr>
+        <w:t>Ce vol est une application concrète du programme de vol.</w:t>
+      </w:r>
+    </w:p>
+    <w:p>
+      <w:pPr>
+        <w:spacing w:line="240" w:lineRule="auto"/>
+        <w:ind w:left="426"/>
+        <w:jc w:val="both"/>
+        <w:rPr>
+          <w:rFonts w:ascii="Calibri" w:hAnsi="Calibri" w:cs="Calibri"/>
+        </w:rPr>
+      </w:pPr>
+    </w:p>
+    <w:p>
+      <w:pPr>
+        <w:spacing w:line="240" w:lineRule="auto"/>
+        <w:ind w:left="426"/>
+        <w:jc w:val="both"/>
+        <w:rPr>
+          <w:rFonts w:ascii="Calibri" w:hAnsi="Calibri" w:cs="Calibri"/>
+        </w:rPr>
+      </w:pPr>
+      <w:r>
+        <w:rPr>
+          <w:rFonts w:ascii="Calibri" w:hAnsi="Calibri" w:cs="Calibri"/>
+        </w:rPr>
+        <w:t>Chaque vol est opéré par une compagnie aérienne spécifique et un avion précis. Il est également rattaché à un aéroport de départ et un aéroport d’arrivée, qui définissent son itinéraire et qui peuvent différer du programme de vol. Les horaires de départ et d’arrivée prévus sont renseignés, ce qui permet aux passagers et aux équipes techniques d’organiser leurs opérations. La gestion de ces informations est cruciale pour éviter les conflits de vols et garantir que les avions sont disponibles aux bons moments. Mais en cas de problème, l’heure de départ et/ou l’heure d’arrivée réelles peuvent bien sûr différer des heures planifiées dans le programme de vol.</w:t>
+      </w:r>
+    </w:p>
+    <w:p>
+      <w:pPr>
+        <w:spacing w:line="240" w:lineRule="auto"/>
+        <w:ind w:left="426"/>
+        <w:jc w:val="both"/>
+        <w:rPr>
+          <w:rFonts w:ascii="Calibri" w:hAnsi="Calibri" w:cs="Calibri"/>
+        </w:rPr>
+      </w:pPr>
+      <w:r>
+        <w:rPr>
+          <w:rFonts w:ascii="Calibri" w:hAnsi="Calibri" w:cs="Calibri"/>
+        </w:rPr>
+        <w:t>Les passagers constituent une autre entité essentielle du système. Chaque passager est enregistré avec un numéro de passeport unique, qui permet d’identifier la personne de manière certaine. Il possède également un nom et un prénom, qui sont utilisés dans les billets d’avion et les systèmes de contrôle à l’aéroport. Le suivi des passagers est important non seulement pour la gestion des réservations, mais aussi pour des raisons de sécurité et de conformité aux réglementations aériennes.</w:t>
+      </w:r>
+    </w:p>
+    <w:p>
+      <w:pPr>
+        <w:spacing w:line="240" w:lineRule="auto"/>
+        <w:ind w:left="426"/>
+        <w:jc w:val="both"/>
+        <w:rPr>
+          <w:rFonts w:ascii="Calibri" w:hAnsi="Calibri" w:cs="Calibri"/>
+        </w:rPr>
+      </w:pPr>
+      <w:r>
+        <w:rPr>
+          <w:rFonts w:ascii="Calibri" w:hAnsi="Calibri" w:cs="Calibri"/>
+        </w:rPr>
+        <w:t>Le système de réservations permet aux passagers de réserver un siège spécifique sur un vol donné. Une réservation est associée à un passager et à un vol précis, garantissant que chaque voyageur dispose d’un siège attribué. Chaque réservation comprend également un prix, qui reflète le coût du billet pour ce vol particulier. Grâce à cette base de données, il est possible de suivre qui a réservé quel vol, d’optimiser le remplissage des avions et de générer des rapports sur les tendances de voyage.</w:t>
+      </w:r>
+    </w:p>
+    <w:p>
+      <w:pPr>
+        <w:spacing w:line="240" w:lineRule="auto"/>
+        <w:ind w:left="426"/>
+        <w:jc w:val="both"/>
+        <w:rPr>
+          <w:rFonts w:ascii="Calibri" w:hAnsi="Calibri" w:cs="Calibri"/>
+        </w:rPr>
+      </w:pPr>
+      <w:r>
+        <w:rPr>
+          <w:rFonts w:ascii="Calibri" w:hAnsi="Calibri" w:cs="Calibri"/>
+        </w:rPr>
+        <w:t xml:space="preserve">L’interconnexion entre ces différentes entités assure une gestion fluide et efficace du trafic aérien. En utilisant ce modèle, l’aéroport </w:t>
+      </w:r>
+      <w:r>
+        <w:rPr>
+          <w:rFonts w:ascii="Calibri" w:hAnsi="Calibri" w:cs="Calibri"/>
+          <w:b/>
+          <w:bCs/>
+        </w:rPr>
+        <w:t>SkyConnect</w:t>
+      </w:r>
+      <w:r>
+        <w:rPr>
+          <w:rFonts w:ascii="Calibri" w:hAnsi="Calibri" w:cs="Calibri"/>
+        </w:rPr>
+        <w:t xml:space="preserve"> peut suivre chaque vol en temps réel, attribuer correctement les avions aux compagnies, gérer les horaires des vols, assurer la coordination entre les passagers et les compagnies aériennes, et garantir une expérience de voyage optimale. Ce système permet également d’optimiser la gestion des ressources aéroportuaires en s’assurant que les avions sont bien utilisés, que les compagnies respectent leurs créneaux horaires et que les passagers disposent d’un suivi clair de leurs réservations.</w:t>
+      </w:r>
+    </w:p>
+    <w:p>
+      <w:pPr>
         <w:pStyle w:val="Titre1"/>
         <w:spacing w:after="0" w:line="240" w:lineRule="auto"/>
         <w:rPr>
@@ -2941,13 +3680,14 @@
           <w:bCs/>
         </w:rPr>
       </w:pPr>
-      <w:bookmarkStart w:id="2" w:name="_Toc241053690"/>
+      <w:bookmarkStart w:id="2" w:name="_Toc241054944"/>
       <w:r>
         <w:rPr>
           <w:rFonts w:ascii="Calibri" w:hAnsi="Calibri" w:cs="Calibri"/>
           <w:b/>
           <w:bCs/>
         </w:rPr>
+        <w:lastRenderedPageBreak/>
         <w:t xml:space="preserve">3. </w:t>
       </w:r>
       <w:r>
@@ -2972,7 +3712,7 @@
           <w:szCs w:val="36"/>
         </w:rPr>
       </w:pPr>
-      <w:bookmarkStart w:id="3" w:name="_Toc241053691"/>
+      <w:bookmarkStart w:id="3" w:name="_Toc241054945"/>
       <w:r>
         <w:rPr>
           <w:rFonts w:ascii="Calibri" w:hAnsi="Calibri" w:cs="Calibri"/>
@@ -3019,7 +3759,7 @@
           <w:szCs w:val="36"/>
         </w:rPr>
       </w:pPr>
-      <w:bookmarkStart w:id="4" w:name="_Toc241053692"/>
+      <w:bookmarkStart w:id="4" w:name="_Toc241054946"/>
       <w:r>
         <w:rPr>
           <w:rFonts w:ascii="Calibri" w:hAnsi="Calibri" w:cs="Calibri"/>
@@ -3067,7 +3807,7 @@
           <w:szCs w:val="36"/>
         </w:rPr>
       </w:pPr>
-      <w:bookmarkStart w:id="5" w:name="_Toc241053693"/>
+      <w:bookmarkStart w:id="5" w:name="_Toc241054947"/>
       <w:r>
         <w:rPr>
           <w:rFonts w:ascii="Calibri" w:hAnsi="Calibri" w:cs="Calibri"/>
@@ -3115,7 +3855,7 @@
           <w:szCs w:val="36"/>
         </w:rPr>
       </w:pPr>
-      <w:bookmarkStart w:id="6" w:name="_Toc241053694"/>
+      <w:bookmarkStart w:id="6" w:name="_Toc241054948"/>
       <w:r>
         <w:rPr>
           <w:rFonts w:ascii="Calibri" w:hAnsi="Calibri" w:cs="Calibri"/>
@@ -3163,7 +3903,7 @@
           <w:szCs w:val="36"/>
         </w:rPr>
       </w:pPr>
-      <w:bookmarkStart w:id="7" w:name="_Toc241053695"/>
+      <w:bookmarkStart w:id="7" w:name="_Toc241054949"/>
       <w:r>
         <w:rPr>
           <w:rFonts w:ascii="Calibri" w:hAnsi="Calibri" w:cs="Calibri"/>
@@ -3211,7 +3951,7 @@
           <w:szCs w:val="36"/>
         </w:rPr>
       </w:pPr>
-      <w:bookmarkStart w:id="8" w:name="_Toc241053696"/>
+      <w:bookmarkStart w:id="8" w:name="_Toc241054950"/>
       <w:r>
         <w:rPr>
           <w:rFonts w:ascii="Calibri" w:hAnsi="Calibri" w:cs="Calibri"/>
@@ -3259,7 +3999,7 @@
           <w:szCs w:val="36"/>
         </w:rPr>
       </w:pPr>
-      <w:bookmarkStart w:id="9" w:name="_Toc241053697"/>
+      <w:bookmarkStart w:id="9" w:name="_Toc241054951"/>
       <w:r>
         <w:rPr>
           <w:rFonts w:ascii="Calibri" w:hAnsi="Calibri" w:cs="Calibri"/>
@@ -3283,7 +4023,7 @@
           <w:bCs/>
         </w:rPr>
       </w:pPr>
-      <w:bookmarkStart w:id="10" w:name="_Toc241053698"/>
+      <w:bookmarkStart w:id="10" w:name="_Toc241054952"/>
       <w:r>
         <w:rPr>
           <w:rFonts w:ascii="Calibri" w:hAnsi="Calibri" w:cs="Calibri"/>
@@ -3332,7 +4072,7 @@
           <w:bCs/>
         </w:rPr>
       </w:pPr>
-      <w:bookmarkStart w:id="11" w:name="_Toc241053699"/>
+      <w:bookmarkStart w:id="11" w:name="_Toc241054953"/>
       <w:r>
         <w:rPr>
           <w:rFonts w:ascii="Calibri" w:hAnsi="Calibri" w:cs="Calibri"/>
@@ -3374,7 +4114,7 @@
           <w:bCs/>
         </w:rPr>
       </w:pPr>
-      <w:bookmarkStart w:id="12" w:name="_Toc241053700"/>
+      <w:bookmarkStart w:id="12" w:name="_Toc241054954"/>
       <w:r>
         <w:rPr>
           <w:rFonts w:ascii="Calibri" w:hAnsi="Calibri" w:cs="Calibri"/>
@@ -3416,7 +4156,7 @@
           <w:bCs/>
         </w:rPr>
       </w:pPr>
-      <w:bookmarkStart w:id="13" w:name="_Toc241053701"/>
+      <w:bookmarkStart w:id="13" w:name="_Toc241054955"/>
       <w:r>
         <w:rPr>
           <w:rFonts w:ascii="Calibri" w:hAnsi="Calibri" w:cs="Calibri"/>
@@ -4169,6 +4909,119 @@
     </w:lvl>
   </w:abstractNum>
   <w:abstractNum w:abstractNumId="4" w15:restartNumberingAfterBreak="0">
+    <w:nsid w:val="19673910"/>
+    <w:multiLevelType w:val="hybridMultilevel"/>
+    <w:tmpl w:val="BFDE3D8C"/>
+    <w:lvl w:ilvl="0" w:tplc="100C0001">
+      <w:start w:val="1"/>
+      <w:numFmt w:val="bullet"/>
+      <w:lvlText w:val=""/>
+      <w:lvlJc w:val="left"/>
+      <w:pPr>
+        <w:ind w:left="1146" w:hanging="360"/>
+      </w:pPr>
+      <w:rPr>
+        <w:rFonts w:ascii="Symbol" w:hAnsi="Symbol" w:hint="default"/>
+      </w:rPr>
+    </w:lvl>
+    <w:lvl w:ilvl="1" w:tplc="100C0003" w:tentative="1">
+      <w:start w:val="1"/>
+      <w:numFmt w:val="bullet"/>
+      <w:lvlText w:val="o"/>
+      <w:lvlJc w:val="left"/>
+      <w:pPr>
+        <w:ind w:left="1866" w:hanging="360"/>
+      </w:pPr>
+      <w:rPr>
+        <w:rFonts w:ascii="Courier New" w:hAnsi="Courier New" w:cs="Courier New" w:hint="default"/>
+      </w:rPr>
+    </w:lvl>
+    <w:lvl w:ilvl="2" w:tplc="100C0005" w:tentative="1">
+      <w:start w:val="1"/>
+      <w:numFmt w:val="bullet"/>
+      <w:lvlText w:val=""/>
+      <w:lvlJc w:val="left"/>
+      <w:pPr>
+        <w:ind w:left="2586" w:hanging="360"/>
+      </w:pPr>
+      <w:rPr>
+        <w:rFonts w:ascii="Wingdings" w:hAnsi="Wingdings" w:hint="default"/>
+      </w:rPr>
+    </w:lvl>
+    <w:lvl w:ilvl="3" w:tplc="100C0001" w:tentative="1">
+      <w:start w:val="1"/>
+      <w:numFmt w:val="bullet"/>
+      <w:lvlText w:val=""/>
+      <w:lvlJc w:val="left"/>
+      <w:pPr>
+        <w:ind w:left="3306" w:hanging="360"/>
+      </w:pPr>
+      <w:rPr>
+        <w:rFonts w:ascii="Symbol" w:hAnsi="Symbol" w:hint="default"/>
+      </w:rPr>
+    </w:lvl>
+    <w:lvl w:ilvl="4" w:tplc="100C0003" w:tentative="1">
+      <w:start w:val="1"/>
+      <w:numFmt w:val="bullet"/>
+      <w:lvlText w:val="o"/>
+      <w:lvlJc w:val="left"/>
+      <w:pPr>
+        <w:ind w:left="4026" w:hanging="360"/>
+      </w:pPr>
+      <w:rPr>
+        <w:rFonts w:ascii="Courier New" w:hAnsi="Courier New" w:cs="Courier New" w:hint="default"/>
+      </w:rPr>
+    </w:lvl>
+    <w:lvl w:ilvl="5" w:tplc="100C0005" w:tentative="1">
+      <w:start w:val="1"/>
+      <w:numFmt w:val="bullet"/>
+      <w:lvlText w:val=""/>
+      <w:lvlJc w:val="left"/>
+      <w:pPr>
+        <w:ind w:left="4746" w:hanging="360"/>
+      </w:pPr>
+      <w:rPr>
+        <w:rFonts w:ascii="Wingdings" w:hAnsi="Wingdings" w:hint="default"/>
+      </w:rPr>
+    </w:lvl>
+    <w:lvl w:ilvl="6" w:tplc="100C0001" w:tentative="1">
+      <w:start w:val="1"/>
+      <w:numFmt w:val="bullet"/>
+      <w:lvlText w:val=""/>
+      <w:lvlJc w:val="left"/>
+      <w:pPr>
+        <w:ind w:left="5466" w:hanging="360"/>
+      </w:pPr>
+      <w:rPr>
+        <w:rFonts w:ascii="Symbol" w:hAnsi="Symbol" w:hint="default"/>
+      </w:rPr>
+    </w:lvl>
+    <w:lvl w:ilvl="7" w:tplc="100C0003" w:tentative="1">
+      <w:start w:val="1"/>
+      <w:numFmt w:val="bullet"/>
+      <w:lvlText w:val="o"/>
+      <w:lvlJc w:val="left"/>
+      <w:pPr>
+        <w:ind w:left="6186" w:hanging="360"/>
+      </w:pPr>
+      <w:rPr>
+        <w:rFonts w:ascii="Courier New" w:hAnsi="Courier New" w:cs="Courier New" w:hint="default"/>
+      </w:rPr>
+    </w:lvl>
+    <w:lvl w:ilvl="8" w:tplc="100C0005" w:tentative="1">
+      <w:start w:val="1"/>
+      <w:numFmt w:val="bullet"/>
+      <w:lvlText w:val=""/>
+      <w:lvlJc w:val="left"/>
+      <w:pPr>
+        <w:ind w:left="6906" w:hanging="360"/>
+      </w:pPr>
+      <w:rPr>
+        <w:rFonts w:ascii="Wingdings" w:hAnsi="Wingdings" w:hint="default"/>
+      </w:rPr>
+    </w:lvl>
+  </w:abstractNum>
+  <w:abstractNum w:abstractNumId="5" w15:restartNumberingAfterBreak="0">
     <w:nsid w:val="1D4D594A"/>
     <w:multiLevelType w:val="hybridMultilevel"/>
     <w:tmpl w:val="F3A0CA4E"/>
@@ -4257,7 +5110,7 @@
       </w:pPr>
     </w:lvl>
   </w:abstractNum>
-  <w:abstractNum w:abstractNumId="5" w15:restartNumberingAfterBreak="0">
+  <w:abstractNum w:abstractNumId="6" w15:restartNumberingAfterBreak="0">
     <w:nsid w:val="1FEF46F5"/>
     <w:multiLevelType w:val="hybridMultilevel"/>
     <w:tmpl w:val="BF940428"/>
@@ -4370,7 +5223,7 @@
       </w:rPr>
     </w:lvl>
   </w:abstractNum>
-  <w:abstractNum w:abstractNumId="6" w15:restartNumberingAfterBreak="0">
+  <w:abstractNum w:abstractNumId="7" w15:restartNumberingAfterBreak="0">
     <w:nsid w:val="24453363"/>
     <w:multiLevelType w:val="hybridMultilevel"/>
     <w:tmpl w:val="5510CBF4"/>
@@ -4456,7 +5309,7 @@
       </w:pPr>
     </w:lvl>
   </w:abstractNum>
-  <w:abstractNum w:abstractNumId="7" w15:restartNumberingAfterBreak="0">
+  <w:abstractNum w:abstractNumId="8" w15:restartNumberingAfterBreak="0">
     <w:nsid w:val="266D6958"/>
     <w:multiLevelType w:val="hybridMultilevel"/>
     <w:tmpl w:val="5BE24594"/>
@@ -4569,7 +5422,7 @@
       </w:rPr>
     </w:lvl>
   </w:abstractNum>
-  <w:abstractNum w:abstractNumId="8" w15:restartNumberingAfterBreak="0">
+  <w:abstractNum w:abstractNumId="9" w15:restartNumberingAfterBreak="0">
     <w:nsid w:val="2FFA3416"/>
     <w:multiLevelType w:val="hybridMultilevel"/>
     <w:tmpl w:val="BC3243AE"/>
@@ -4682,7 +5535,7 @@
       </w:rPr>
     </w:lvl>
   </w:abstractNum>
-  <w:abstractNum w:abstractNumId="9" w15:restartNumberingAfterBreak="0">
+  <w:abstractNum w:abstractNumId="10" w15:restartNumberingAfterBreak="0">
     <w:nsid w:val="351F27AF"/>
     <w:multiLevelType w:val="hybridMultilevel"/>
     <w:tmpl w:val="4FACF0EA"/>
@@ -4795,7 +5648,7 @@
       </w:rPr>
     </w:lvl>
   </w:abstractNum>
-  <w:abstractNum w:abstractNumId="10" w15:restartNumberingAfterBreak="0">
+  <w:abstractNum w:abstractNumId="11" w15:restartNumberingAfterBreak="0">
     <w:nsid w:val="37A45B63"/>
     <w:multiLevelType w:val="hybridMultilevel"/>
     <w:tmpl w:val="4CBAE43C"/>
@@ -4908,7 +5761,7 @@
       </w:rPr>
     </w:lvl>
   </w:abstractNum>
-  <w:abstractNum w:abstractNumId="11" w15:restartNumberingAfterBreak="0">
+  <w:abstractNum w:abstractNumId="12" w15:restartNumberingAfterBreak="0">
     <w:nsid w:val="38027554"/>
     <w:multiLevelType w:val="hybridMultilevel"/>
     <w:tmpl w:val="C60EC468"/>
@@ -5021,7 +5874,7 @@
       </w:rPr>
     </w:lvl>
   </w:abstractNum>
-  <w:abstractNum w:abstractNumId="12" w15:restartNumberingAfterBreak="0">
+  <w:abstractNum w:abstractNumId="13" w15:restartNumberingAfterBreak="0">
     <w:nsid w:val="3EAC0DBD"/>
     <w:multiLevelType w:val="hybridMultilevel"/>
     <w:tmpl w:val="6602F682"/>
@@ -5134,7 +5987,7 @@
       </w:rPr>
     </w:lvl>
   </w:abstractNum>
-  <w:abstractNum w:abstractNumId="13" w15:restartNumberingAfterBreak="0">
+  <w:abstractNum w:abstractNumId="14" w15:restartNumberingAfterBreak="0">
     <w:nsid w:val="409E3B2C"/>
     <w:multiLevelType w:val="hybridMultilevel"/>
     <w:tmpl w:val="A16C1916"/>
@@ -5274,7 +6127,7 @@
       </w:rPr>
     </w:lvl>
   </w:abstractNum>
-  <w:abstractNum w:abstractNumId="14" w15:restartNumberingAfterBreak="0">
+  <w:abstractNum w:abstractNumId="15" w15:restartNumberingAfterBreak="0">
     <w:nsid w:val="46934322"/>
     <w:multiLevelType w:val="hybridMultilevel"/>
     <w:tmpl w:val="691E28DC"/>
@@ -5387,7 +6240,7 @@
       </w:rPr>
     </w:lvl>
   </w:abstractNum>
-  <w:abstractNum w:abstractNumId="15" w15:restartNumberingAfterBreak="0">
+  <w:abstractNum w:abstractNumId="16" w15:restartNumberingAfterBreak="0">
     <w:nsid w:val="4CE06E49"/>
     <w:multiLevelType w:val="hybridMultilevel"/>
     <w:tmpl w:val="A59E08BC"/>
@@ -5476,7 +6329,7 @@
       </w:pPr>
     </w:lvl>
   </w:abstractNum>
-  <w:abstractNum w:abstractNumId="16" w15:restartNumberingAfterBreak="0">
+  <w:abstractNum w:abstractNumId="17" w15:restartNumberingAfterBreak="0">
     <w:nsid w:val="51CB2DBF"/>
     <w:multiLevelType w:val="hybridMultilevel"/>
     <w:tmpl w:val="0DF25F8C"/>
@@ -5589,7 +6442,7 @@
       </w:rPr>
     </w:lvl>
   </w:abstractNum>
-  <w:abstractNum w:abstractNumId="17" w15:restartNumberingAfterBreak="0">
+  <w:abstractNum w:abstractNumId="18" w15:restartNumberingAfterBreak="0">
     <w:nsid w:val="569D7CC1"/>
     <w:multiLevelType w:val="hybridMultilevel"/>
     <w:tmpl w:val="B3A8C868"/>
@@ -5702,7 +6555,120 @@
       </w:rPr>
     </w:lvl>
   </w:abstractNum>
-  <w:abstractNum w:abstractNumId="18" w15:restartNumberingAfterBreak="0">
+  <w:abstractNum w:abstractNumId="19" w15:restartNumberingAfterBreak="0">
+    <w:nsid w:val="60D81934"/>
+    <w:multiLevelType w:val="hybridMultilevel"/>
+    <w:tmpl w:val="1CEA9640"/>
+    <w:lvl w:ilvl="0" w:tplc="100C0001">
+      <w:start w:val="1"/>
+      <w:numFmt w:val="bullet"/>
+      <w:lvlText w:val=""/>
+      <w:lvlJc w:val="left"/>
+      <w:pPr>
+        <w:ind w:left="1146" w:hanging="360"/>
+      </w:pPr>
+      <w:rPr>
+        <w:rFonts w:ascii="Symbol" w:hAnsi="Symbol" w:hint="default"/>
+      </w:rPr>
+    </w:lvl>
+    <w:lvl w:ilvl="1" w:tplc="100C0003" w:tentative="1">
+      <w:start w:val="1"/>
+      <w:numFmt w:val="bullet"/>
+      <w:lvlText w:val="o"/>
+      <w:lvlJc w:val="left"/>
+      <w:pPr>
+        <w:ind w:left="1866" w:hanging="360"/>
+      </w:pPr>
+      <w:rPr>
+        <w:rFonts w:ascii="Courier New" w:hAnsi="Courier New" w:cs="Courier New" w:hint="default"/>
+      </w:rPr>
+    </w:lvl>
+    <w:lvl w:ilvl="2" w:tplc="100C0005" w:tentative="1">
+      <w:start w:val="1"/>
+      <w:numFmt w:val="bullet"/>
+      <w:lvlText w:val=""/>
+      <w:lvlJc w:val="left"/>
+      <w:pPr>
+        <w:ind w:left="2586" w:hanging="360"/>
+      </w:pPr>
+      <w:rPr>
+        <w:rFonts w:ascii="Wingdings" w:hAnsi="Wingdings" w:hint="default"/>
+      </w:rPr>
+    </w:lvl>
+    <w:lvl w:ilvl="3" w:tplc="100C0001" w:tentative="1">
+      <w:start w:val="1"/>
+      <w:numFmt w:val="bullet"/>
+      <w:lvlText w:val=""/>
+      <w:lvlJc w:val="left"/>
+      <w:pPr>
+        <w:ind w:left="3306" w:hanging="360"/>
+      </w:pPr>
+      <w:rPr>
+        <w:rFonts w:ascii="Symbol" w:hAnsi="Symbol" w:hint="default"/>
+      </w:rPr>
+    </w:lvl>
+    <w:lvl w:ilvl="4" w:tplc="100C0003" w:tentative="1">
+      <w:start w:val="1"/>
+      <w:numFmt w:val="bullet"/>
+      <w:lvlText w:val="o"/>
+      <w:lvlJc w:val="left"/>
+      <w:pPr>
+        <w:ind w:left="4026" w:hanging="360"/>
+      </w:pPr>
+      <w:rPr>
+        <w:rFonts w:ascii="Courier New" w:hAnsi="Courier New" w:cs="Courier New" w:hint="default"/>
+      </w:rPr>
+    </w:lvl>
+    <w:lvl w:ilvl="5" w:tplc="100C0005" w:tentative="1">
+      <w:start w:val="1"/>
+      <w:numFmt w:val="bullet"/>
+      <w:lvlText w:val=""/>
+      <w:lvlJc w:val="left"/>
+      <w:pPr>
+        <w:ind w:left="4746" w:hanging="360"/>
+      </w:pPr>
+      <w:rPr>
+        <w:rFonts w:ascii="Wingdings" w:hAnsi="Wingdings" w:hint="default"/>
+      </w:rPr>
+    </w:lvl>
+    <w:lvl w:ilvl="6" w:tplc="100C0001" w:tentative="1">
+      <w:start w:val="1"/>
+      <w:numFmt w:val="bullet"/>
+      <w:lvlText w:val=""/>
+      <w:lvlJc w:val="left"/>
+      <w:pPr>
+        <w:ind w:left="5466" w:hanging="360"/>
+      </w:pPr>
+      <w:rPr>
+        <w:rFonts w:ascii="Symbol" w:hAnsi="Symbol" w:hint="default"/>
+      </w:rPr>
+    </w:lvl>
+    <w:lvl w:ilvl="7" w:tplc="100C0003" w:tentative="1">
+      <w:start w:val="1"/>
+      <w:numFmt w:val="bullet"/>
+      <w:lvlText w:val="o"/>
+      <w:lvlJc w:val="left"/>
+      <w:pPr>
+        <w:ind w:left="6186" w:hanging="360"/>
+      </w:pPr>
+      <w:rPr>
+        <w:rFonts w:ascii="Courier New" w:hAnsi="Courier New" w:cs="Courier New" w:hint="default"/>
+      </w:rPr>
+    </w:lvl>
+    <w:lvl w:ilvl="8" w:tplc="100C0005" w:tentative="1">
+      <w:start w:val="1"/>
+      <w:numFmt w:val="bullet"/>
+      <w:lvlText w:val=""/>
+      <w:lvlJc w:val="left"/>
+      <w:pPr>
+        <w:ind w:left="6906" w:hanging="360"/>
+      </w:pPr>
+      <w:rPr>
+        <w:rFonts w:ascii="Wingdings" w:hAnsi="Wingdings" w:hint="default"/>
+      </w:rPr>
+    </w:lvl>
+  </w:abstractNum>
+  <w:abstractNum w:abstractNumId="20" w15:restartNumberingAfterBreak="0">
     <w:nsid w:val="611B2273"/>
     <w:multiLevelType w:val="hybridMultilevel"/>
     <w:tmpl w:val="7E50306A"/>
@@ -5815,7 +6781,7 @@
       </w:rPr>
     </w:lvl>
   </w:abstractNum>
-  <w:abstractNum w:abstractNumId="19" w15:restartNumberingAfterBreak="0">
+  <w:abstractNum w:abstractNumId="21" w15:restartNumberingAfterBreak="0">
     <w:nsid w:val="63F91084"/>
     <w:multiLevelType w:val="hybridMultilevel"/>
     <w:tmpl w:val="996088D6"/>
@@ -5928,7 +6894,7 @@
       </w:rPr>
     </w:lvl>
   </w:abstractNum>
-  <w:abstractNum w:abstractNumId="20" w15:restartNumberingAfterBreak="0">
+  <w:abstractNum w:abstractNumId="22" w15:restartNumberingAfterBreak="0">
     <w:nsid w:val="647F1D0D"/>
     <w:multiLevelType w:val="hybridMultilevel"/>
     <w:tmpl w:val="8648D7FE"/>
@@ -6014,7 +6980,120 @@
       </w:pPr>
     </w:lvl>
   </w:abstractNum>
-  <w:abstractNum w:abstractNumId="21" w15:restartNumberingAfterBreak="0">
+  <w:abstractNum w:abstractNumId="23" w15:restartNumberingAfterBreak="0">
+    <w:nsid w:val="67323948"/>
+    <w:multiLevelType w:val="hybridMultilevel"/>
+    <w:tmpl w:val="7BD295C8"/>
+    <w:lvl w:ilvl="0" w:tplc="100C0001">
+      <w:start w:val="1"/>
+      <w:numFmt w:val="bullet"/>
+      <w:lvlText w:val=""/>
+      <w:lvlJc w:val="left"/>
+      <w:pPr>
+        <w:ind w:left="1146" w:hanging="360"/>
+      </w:pPr>
+      <w:rPr>
+        <w:rFonts w:ascii="Symbol" w:hAnsi="Symbol" w:hint="default"/>
+      </w:rPr>
+    </w:lvl>
+    <w:lvl w:ilvl="1" w:tplc="100C0003" w:tentative="1">
+      <w:start w:val="1"/>
+      <w:numFmt w:val="bullet"/>
+      <w:lvlText w:val="o"/>
+      <w:lvlJc w:val="left"/>
+      <w:pPr>
+        <w:ind w:left="1866" w:hanging="360"/>
+      </w:pPr>
+      <w:rPr>
+        <w:rFonts w:ascii="Courier New" w:hAnsi="Courier New" w:cs="Courier New" w:hint="default"/>
+      </w:rPr>
+    </w:lvl>
+    <w:lvl w:ilvl="2" w:tplc="100C0005" w:tentative="1">
+      <w:start w:val="1"/>
+      <w:numFmt w:val="bullet"/>
+      <w:lvlText w:val=""/>
+      <w:lvlJc w:val="left"/>
+      <w:pPr>
+        <w:ind w:left="2586" w:hanging="360"/>
+      </w:pPr>
+      <w:rPr>
+        <w:rFonts w:ascii="Wingdings" w:hAnsi="Wingdings" w:hint="default"/>
+      </w:rPr>
+    </w:lvl>
+    <w:lvl w:ilvl="3" w:tplc="100C0001" w:tentative="1">
+      <w:start w:val="1"/>
+      <w:numFmt w:val="bullet"/>
+      <w:lvlText w:val=""/>
+      <w:lvlJc w:val="left"/>
+      <w:pPr>
+        <w:ind w:left="3306" w:hanging="360"/>
+      </w:pPr>
+      <w:rPr>
+        <w:rFonts w:ascii="Symbol" w:hAnsi="Symbol" w:hint="default"/>
+      </w:rPr>
+    </w:lvl>
+    <w:lvl w:ilvl="4" w:tplc="100C0003" w:tentative="1">
+      <w:start w:val="1"/>
+      <w:numFmt w:val="bullet"/>
+      <w:lvlText w:val="o"/>
+      <w:lvlJc w:val="left"/>
+      <w:pPr>
+        <w:ind w:left="4026" w:hanging="360"/>
+      </w:pPr>
+      <w:rPr>
+        <w:rFonts w:ascii="Courier New" w:hAnsi="Courier New" w:cs="Courier New" w:hint="default"/>
+      </w:rPr>
+    </w:lvl>
+    <w:lvl w:ilvl="5" w:tplc="100C0005" w:tentative="1">
+      <w:start w:val="1"/>
+      <w:numFmt w:val="bullet"/>
+      <w:lvlText w:val=""/>
+      <w:lvlJc w:val="left"/>
+      <w:pPr>
+        <w:ind w:left="4746" w:hanging="360"/>
+      </w:pPr>
+      <w:rPr>
+        <w:rFonts w:ascii="Wingdings" w:hAnsi="Wingdings" w:hint="default"/>
+      </w:rPr>
+    </w:lvl>
+    <w:lvl w:ilvl="6" w:tplc="100C0001" w:tentative="1">
+      <w:start w:val="1"/>
+      <w:numFmt w:val="bullet"/>
+      <w:lvlText w:val=""/>
+      <w:lvlJc w:val="left"/>
+      <w:pPr>
+        <w:ind w:left="5466" w:hanging="360"/>
+      </w:pPr>
+      <w:rPr>
+        <w:rFonts w:ascii="Symbol" w:hAnsi="Symbol" w:hint="default"/>
+      </w:rPr>
+    </w:lvl>
+    <w:lvl w:ilvl="7" w:tplc="100C0003" w:tentative="1">
+      <w:start w:val="1"/>
+      <w:numFmt w:val="bullet"/>
+      <w:lvlText w:val="o"/>
+      <w:lvlJc w:val="left"/>
+      <w:pPr>
+        <w:ind w:left="6186" w:hanging="360"/>
+      </w:pPr>
+      <w:rPr>
+        <w:rFonts w:ascii="Courier New" w:hAnsi="Courier New" w:cs="Courier New" w:hint="default"/>
+      </w:rPr>
+    </w:lvl>
+    <w:lvl w:ilvl="8" w:tplc="100C0005" w:tentative="1">
+      <w:start w:val="1"/>
+      <w:numFmt w:val="bullet"/>
+      <w:lvlText w:val=""/>
+      <w:lvlJc w:val="left"/>
+      <w:pPr>
+        <w:ind w:left="6906" w:hanging="360"/>
+      </w:pPr>
+      <w:rPr>
+        <w:rFonts w:ascii="Wingdings" w:hAnsi="Wingdings" w:hint="default"/>
+      </w:rPr>
+    </w:lvl>
+  </w:abstractNum>
+  <w:abstractNum w:abstractNumId="24" w15:restartNumberingAfterBreak="0">
     <w:nsid w:val="68706354"/>
     <w:multiLevelType w:val="hybridMultilevel"/>
     <w:tmpl w:val="D4CAF374"/>
@@ -6154,7 +7233,7 @@
       </w:rPr>
     </w:lvl>
   </w:abstractNum>
-  <w:abstractNum w:abstractNumId="22" w15:restartNumberingAfterBreak="0">
+  <w:abstractNum w:abstractNumId="25" w15:restartNumberingAfterBreak="0">
     <w:nsid w:val="6DF771E1"/>
     <w:multiLevelType w:val="hybridMultilevel"/>
     <w:tmpl w:val="28CC9E4A"/>
@@ -6267,7 +7346,7 @@
       </w:rPr>
     </w:lvl>
   </w:abstractNum>
-  <w:abstractNum w:abstractNumId="23" w15:restartNumberingAfterBreak="0">
+  <w:abstractNum w:abstractNumId="26" w15:restartNumberingAfterBreak="0">
     <w:nsid w:val="71B21769"/>
     <w:multiLevelType w:val="hybridMultilevel"/>
     <w:tmpl w:val="96C81336"/>
@@ -6380,7 +7459,7 @@
       </w:rPr>
     </w:lvl>
   </w:abstractNum>
-  <w:abstractNum w:abstractNumId="24" w15:restartNumberingAfterBreak="0">
+  <w:abstractNum w:abstractNumId="27" w15:restartNumberingAfterBreak="0">
     <w:nsid w:val="72CD635C"/>
     <w:multiLevelType w:val="hybridMultilevel"/>
     <w:tmpl w:val="2766D7A0"/>
@@ -6493,7 +7572,7 @@
       </w:rPr>
     </w:lvl>
   </w:abstractNum>
-  <w:abstractNum w:abstractNumId="25" w15:restartNumberingAfterBreak="0">
+  <w:abstractNum w:abstractNumId="28" w15:restartNumberingAfterBreak="0">
     <w:nsid w:val="785244FF"/>
     <w:multiLevelType w:val="hybridMultilevel"/>
     <w:tmpl w:val="7B56396A"/>
@@ -6579,7 +7658,7 @@
       </w:pPr>
     </w:lvl>
   </w:abstractNum>
-  <w:abstractNum w:abstractNumId="26" w15:restartNumberingAfterBreak="0">
+  <w:abstractNum w:abstractNumId="29" w15:restartNumberingAfterBreak="0">
     <w:nsid w:val="79756143"/>
     <w:multiLevelType w:val="hybridMultilevel"/>
     <w:tmpl w:val="6634534C"/>
@@ -6692,7 +7771,7 @@
       </w:rPr>
     </w:lvl>
   </w:abstractNum>
-  <w:abstractNum w:abstractNumId="27" w15:restartNumberingAfterBreak="0">
+  <w:abstractNum w:abstractNumId="30" w15:restartNumberingAfterBreak="0">
     <w:nsid w:val="7D4501B9"/>
     <w:multiLevelType w:val="hybridMultilevel"/>
     <w:tmpl w:val="83B64B2C"/>
@@ -6806,88 +7885,97 @@
     </w:lvl>
   </w:abstractNum>
   <w:num w:numId="1" w16cid:durableId="1203133388">
-    <w:abstractNumId w:val="20"/>
+    <w:abstractNumId w:val="22"/>
   </w:num>
   <w:num w:numId="2" w16cid:durableId="136774178">
+    <w:abstractNumId w:val="28"/>
+  </w:num>
+  <w:num w:numId="3" w16cid:durableId="1603030040">
+    <w:abstractNumId w:val="29"/>
+  </w:num>
+  <w:num w:numId="4" w16cid:durableId="328798260">
+    <w:abstractNumId w:val="17"/>
+  </w:num>
+  <w:num w:numId="5" w16cid:durableId="1009866966">
+    <w:abstractNumId w:val="21"/>
+  </w:num>
+  <w:num w:numId="6" w16cid:durableId="886719929">
+    <w:abstractNumId w:val="30"/>
+  </w:num>
+  <w:num w:numId="7" w16cid:durableId="1211848318">
+    <w:abstractNumId w:val="18"/>
+  </w:num>
+  <w:num w:numId="8" w16cid:durableId="1892644994">
     <w:abstractNumId w:val="25"/>
   </w:num>
-  <w:num w:numId="3" w16cid:durableId="1603030040">
-    <w:abstractNumId w:val="26"/>
-  </w:num>
-  <w:num w:numId="4" w16cid:durableId="328798260">
-    <w:abstractNumId w:val="16"/>
-  </w:num>
-  <w:num w:numId="5" w16cid:durableId="1009866966">
-    <w:abstractNumId w:val="19"/>
-  </w:num>
-  <w:num w:numId="6" w16cid:durableId="886719929">
-    <w:abstractNumId w:val="27"/>
-  </w:num>
-  <w:num w:numId="7" w16cid:durableId="1211848318">
-    <w:abstractNumId w:val="17"/>
-  </w:num>
-  <w:num w:numId="8" w16cid:durableId="1892644994">
-    <w:abstractNumId w:val="22"/>
-  </w:num>
   <w:num w:numId="9" w16cid:durableId="644434909">
-    <w:abstractNumId w:val="9"/>
+    <w:abstractNumId w:val="10"/>
   </w:num>
   <w:num w:numId="10" w16cid:durableId="439683412">
-    <w:abstractNumId w:val="4"/>
+    <w:abstractNumId w:val="5"/>
   </w:num>
   <w:num w:numId="11" w16cid:durableId="939991775">
     <w:abstractNumId w:val="2"/>
   </w:num>
   <w:num w:numId="12" w16cid:durableId="1222905011">
-    <w:abstractNumId w:val="13"/>
+    <w:abstractNumId w:val="14"/>
   </w:num>
   <w:num w:numId="13" w16cid:durableId="1861966893">
-    <w:abstractNumId w:val="21"/>
+    <w:abstractNumId w:val="24"/>
   </w:num>
   <w:num w:numId="14" w16cid:durableId="246967512">
-    <w:abstractNumId w:val="15"/>
+    <w:abstractNumId w:val="16"/>
   </w:num>
   <w:num w:numId="15" w16cid:durableId="177357244">
     <w:abstractNumId w:val="3"/>
   </w:num>
   <w:num w:numId="16" w16cid:durableId="326636809">
-    <w:abstractNumId w:val="6"/>
+    <w:abstractNumId w:val="7"/>
   </w:num>
   <w:num w:numId="17" w16cid:durableId="797644705">
-    <w:abstractNumId w:val="8"/>
+    <w:abstractNumId w:val="9"/>
   </w:num>
   <w:num w:numId="18" w16cid:durableId="1479542079">
     <w:abstractNumId w:val="0"/>
   </w:num>
   <w:num w:numId="19" w16cid:durableId="1195920320">
-    <w:abstractNumId w:val="10"/>
+    <w:abstractNumId w:val="11"/>
   </w:num>
   <w:num w:numId="20" w16cid:durableId="416832827">
-    <w:abstractNumId w:val="24"/>
+    <w:abstractNumId w:val="27"/>
   </w:num>
   <w:num w:numId="21" w16cid:durableId="1931964657">
-    <w:abstractNumId w:val="7"/>
+    <w:abstractNumId w:val="8"/>
   </w:num>
   <w:num w:numId="22" w16cid:durableId="1932395727">
-    <w:abstractNumId w:val="5"/>
+    <w:abstractNumId w:val="6"/>
   </w:num>
   <w:num w:numId="23" w16cid:durableId="927037760">
-    <w:abstractNumId w:val="23"/>
+    <w:abstractNumId w:val="26"/>
   </w:num>
   <w:num w:numId="24" w16cid:durableId="1124302307">
-    <w:abstractNumId w:val="12"/>
+    <w:abstractNumId w:val="13"/>
   </w:num>
   <w:num w:numId="25" w16cid:durableId="483739954">
-    <w:abstractNumId w:val="14"/>
+    <w:abstractNumId w:val="15"/>
   </w:num>
   <w:num w:numId="26" w16cid:durableId="224683690">
-    <w:abstractNumId w:val="18"/>
+    <w:abstractNumId w:val="20"/>
   </w:num>
   <w:num w:numId="27" w16cid:durableId="1440758041">
-    <w:abstractNumId w:val="11"/>
+    <w:abstractNumId w:val="12"/>
   </w:num>
   <w:num w:numId="28" w16cid:durableId="2104110605">
     <w:abstractNumId w:val="1"/>
+  </w:num>
+  <w:num w:numId="29" w16cid:durableId="309331396">
+    <w:abstractNumId w:val="23"/>
+  </w:num>
+  <w:num w:numId="30" w16cid:durableId="2095396702">
+    <w:abstractNumId w:val="19"/>
+  </w:num>
+  <w:num w:numId="31" w16cid:durableId="1696226800">
+    <w:abstractNumId w:val="4"/>
   </w:num>
 </w:numbering>
 </file>
@@ -7492,7 +8580,6 @@
   <w:style w:type="character" w:default="1" w:styleId="Policepardfaut">
     <w:name w:val="Default Paragraph Font"/>
     <w:uiPriority w:val="1"/>
-    <w:semiHidden/>
     <w:unhideWhenUsed/>
   </w:style>
   <w:style w:type="table" w:default="1" w:styleId="TableauNormal">

</xml_diff>